<commit_message>
entrega: actualiza §5 del informe al tablero v3 (merge feat/viz)
- §5.3: 4 páginas/paleta púrpura → 7 páginas + paleta semáforo + navegación lateral
- §5.2: mapa pregunta→gráfico a los visuales v3 (embudo, barras por categoría,
  scatter de marcas, donut + Sankey, combo por hora)
- §5.4: interactividad a Top-N sincronizados + navegación; pendiente reformulado
  a integrar clustering C0–C3 en «Análisis de cliente»

Co-Authored-By: Claude Opus 4.8 (1M context) <noreply@anthropic.com>
</commit_message>
<xml_diff>
--- a/entrega_final/Informe_Final_PI_Grupo8_plantilla.docx
+++ b/entrega_final/Informe_Final_PI_Grupo8_plantilla.docx
@@ -7163,13 +7163,13 @@
           <w:b/>
           <w:lang w:val="es-CO"/>
         </w:rPr>
-        <w:t xml:space="preserve">Palanca A — dónde está la fuga: </w:t>
-      </w:r>
-      <w:r>
-        <w:rPr>
-          <w:lang w:val="es-CO"/>
-        </w:rPr>
-        <w:t>funnel por categoría (treemap/barras), dinero en carritos abandonados (treemap por área) y drill de marcas del premio (barras).</w:t>
+        <w:t xml:space="preserve">¿Cuánto se pierde? </w:t>
+      </w:r>
+      <w:r>
+        <w:rPr>
+          <w:lang w:val="es-CO"/>
+        </w:rPr>
+        <w:t>→ embudo vistas (56,8 mill.) → carritos (2,2 mill.) → compras (1,3 mill.), con tarjetas KPI de carritos abandonados, tasa de abandono, conversión y ganancias perdidas («El problema»).</w:t>
       </w:r>
     </w:p>
     <w:p>
@@ -7189,13 +7189,13 @@
           <w:b/>
           <w:lang w:val="es-CO"/>
         </w:rPr>
-        <w:t xml:space="preserve">Palanca B — a quién retener: </w:t>
-      </w:r>
-      <w:r>
-        <w:rPr>
-          <w:lang w:val="es-CO"/>
-        </w:rPr>
-        <w:t>segmentos de comprador (combo de doble eje, % compradores vs % revenue).</w:t>
+        <w:t xml:space="preserve">¿Dónde se concentra la fuga? </w:t>
+      </w:r>
+      <w:r>
+        <w:rPr>
+          <w:lang w:val="es-CO"/>
+        </w:rPr>
+        <w:t>cuatro barras horizontales por categoría (valor, ganancias, conversión y ganancias perdidas) que exponen la paradoja de electronics, y a nivel de marca el Top-N + un scatter ticket × abandono («Análisis por categoría» y «Detalle Electronics»).</w:t>
       </w:r>
     </w:p>
     <w:p>
@@ -7215,13 +7215,13 @@
           <w:b/>
           <w:lang w:val="es-CO"/>
         </w:rPr>
-        <w:t xml:space="preserve">Contexto/diagnóstico: </w:t>
-      </w:r>
-      <w:r>
-        <w:rPr>
-          <w:lang w:val="es-CO"/>
-        </w:rPr>
-        <w:t>embudo global, tipología de visitante, cuándo intervenir (heatmap hora × día) y evolución temporal con toggle día↔hora y slicers de categoría/marca.</w:t>
+        <w:t xml:space="preserve">¿Quién compra y cuándo? </w:t>
+      </w:r>
+      <w:r>
+        <w:rPr>
+          <w:lang w:val="es-CO"/>
+        </w:rPr>
+        <w:t>donut de tipología (navegadores 85,0 % / con intención 9,3 % / activos 5,6 %) y Sankey compradores→revenue (recurrente 35,7 % = 73,7 % del revenue), más el combo de conversión por hora que separa el volumen (tarde) de la conversión (mañana) («Análisis de cliente» y «Contexto temporal»).</w:t>
       </w:r>
     </w:p>
     <w:p>
@@ -7252,7 +7252,7 @@
         <w:rPr>
           <w:lang w:val="es-CO"/>
         </w:rPr>
-        <w:t>Cuatro páginas con portada y navegación: (1) Análisis global (KPIs + funnel + tipología + segmentos con Top-N dinámico), (2) Detalle Electronics (ticket, abandono, marcas, scatter ticket × abandono), (3) Contexto temporal (tráfico vs conversión diaria, con anotaciones de calidad de datos: ventana 14–17 nov y Black Friday). Paleta púrpura coherente. Cada página sostiene un paso de la narrativa, no una pila de gráficos.</w:t>
+        <w:t>Siete páginas con navegación lateral (panel izquierdo de botones numerados, visible en todas): (1) Inicio, (2) El problema (embudo vistas→carrito→compra + KPIs de abandono), (3) Análisis por categoría (cuatro barras horizontales en 2×2 + Top-N), (4) Detalle Electronics (Top-N de marcas + scatter ticket × abandono), (5) Análisis de cliente (donut de tipología + Sankey compradores→revenue), (6) Contexto temporal (combo vistas vs conversión por hora) y (7) Cierre (respuesta a la Pregunta de Oro). Paleta semáforo coherente —gris #2D2D2D para contexto, verde #3B6D11 para oportunidad, rojo #A32D2D para alerta/pérdida— sobre tipografía Segoe UI, aplicando data-ink ratio, atributos preatentivos, Gestalt y patrón Z. Cada página cierra con una frase accionable (contexto → hallazgo → negocio → acción); la ventana 14–17 nov se filtra antes de graficar.</w:t>
       </w:r>
     </w:p>
     <w:p>
@@ -7300,7 +7300,7 @@
         <w:rPr>
           <w:lang w:val="es-CO"/>
         </w:rPr>
-        <w:t>La conversión se crea como medida (SUM(purchases)/SUM(views)) para que respete el filtro activo; field parameters para el toggle día↔hora y slicers de categoría/marca.</w:t>
+        <w:t>Filtros Top-N sincronizados mediante medidas (categorías 5/10/15; marcas 5/10/20) que controlan varias gráficas a la vez; conversión como medida (SUM(purchases)/SUM(views)) para respetar el filtro activo; panel de navegación lateral en todas las páginas para recorrer la narrativa y filtrar en vivo.</w:t>
       </w:r>
     </w:p>
     <w:p>
@@ -7351,7 +7351,7 @@
           <w:color w:val="C00000"/>
           <w:lang w:val="es-CO"/>
         </w:rPr>
-        <w:t>[ POR COMPLETAR ] Confirmar la v2 del tablero con los scores del modelo (matriz de oportunidad probabilidad × valor) — en finalización por Kelly.</w:t>
+        <w:t>[ POR COMPLETAR ] Integrar el clustering de Sara (segmentos C0–C3) en la página «Análisis de cliente» — el cruce clasificador × clustering, pendiente por Kelly.</w:t>
       </w:r>
     </w:p>
     <w:p>

</xml_diff>

<commit_message>
entrega: amplía §4.1 "Persistencia de modelos" (scoring batch Serverless + Contrato 2)
Detalla entrenamiento/calibración local, las 3 restricciones de Databricks
Serverless (memoria del driver, ausencia de sparkContext, incompatibilidad
NumPy), tracking MLflow y la tabla Delta workspace.default.contrato2.

Co-Authored-By: Claude Opus 4.8 (1M context) <noreply@anthropic.com>
</commit_message>
<xml_diff>
--- a/entrega_final/Informe_Final_PI_Grupo8_plantilla.docx
+++ b/entrega_final/Informe_Final_PI_Grupo8_plantilla.docx
@@ -6970,13 +6970,124 @@
           <w:b/>
           <w:lang w:val="es-CO"/>
         </w:rPr>
-        <w:t xml:space="preserve">Persistencia de modelos. </w:t>
-      </w:r>
-      <w:r>
-        <w:rPr>
-          <w:lang w:val="es-CO"/>
-        </w:rPr>
-        <w:t>MLflow para tracking (params, PR-AUC/Brier), el modelo calibrado y su signature; el scoring batch materializa la salida del modelo (user_session, probabilidad calibrada, segmento) en Delta.</w:t>
+        <w:t xml:space="preserve">Persistencia de modelos y scoring batch sobre Databricks Serverless. </w:t>
+      </w:r>
+      <w:r>
+        <w:rPr>
+          <w:lang w:val="es-CO"/>
+        </w:rPr>
+        <w:t xml:space="preserve">El modelo de propensión se entrenó y calibró íntegramente en el entorno local (Python, scikit-learn, LightGBM) donde los 16.97 M de filas de entrenamiento caben con margen en la memoria del proceso. El artefacto resultante (CalibratedClassifierCV sobre LightGBM, serializado con joblib) se subió al Volume de Databricks para su uso en el pipeline de producción.</w:t>
+      </w:r>
+    </w:p>
+    <w:p>
+      <w:pPr>
+        <w:spacing w:after="160" w:line="276" w:lineRule="auto"/>
+        <w:jc w:val="both"/>
+        <w:rPr>
+          <w:lang w:val="es-CO"/>
+        </w:rPr>
+      </w:pPr>
+      <w:r>
+        <w:rPr>
+          <w:lang w:val="es-CO"/>
+        </w:rPr>
+        <w:t xml:space="preserve">El scoring batch sobre las 19.71 M sesiones limpias introdujo tres restricciones no triviales del entorno Serverless, cada una con una decisión de ingeniería específica:</w:t>
+      </w:r>
+    </w:p>
+    <w:p>
+      <w:pPr>
+        <w:spacing w:after="160" w:line="276" w:lineRule="auto"/>
+        <w:jc w:val="both"/>
+        <w:rPr>
+          <w:lang w:val="es-CO"/>
+        </w:rPr>
+      </w:pPr>
+      <w:r>
+        <w:rPr>
+          <w:b/>
+          <w:lang w:val="es-CO"/>
+        </w:rPr>
+        <w:t xml:space="preserve">(1) Restricción de memoria del driver. </w:t>
+      </w:r>
+      <w:r>
+        <w:rPr>
+          <w:lang w:val="es-CO"/>
+        </w:rPr>
+        <w:t xml:space="preserve">Cargar el parquet completo en pandas (19.71 M filas) agota la memoria disponible del driver (salida con código 137, SIGKILL por OOM). La solución adoptada fue mantener los datos siempre en un Spark DataFrame perezoso —nunca materializado en el driver— y canalizar la inferencia a través de pandas UDFs que procesan particiones en minibloque. El único dato que baja al driver es la muestra de 300 k sesiones usada para ajustar el escalador y el K-Means (≈ 28 MB).</w:t>
+      </w:r>
+    </w:p>
+    <w:p>
+      <w:pPr>
+        <w:spacing w:after="160" w:line="276" w:lineRule="auto"/>
+        <w:jc w:val="both"/>
+        <w:rPr>
+          <w:lang w:val="es-CO"/>
+        </w:rPr>
+      </w:pPr>
+      <w:r>
+        <w:rPr>
+          <w:b/>
+          <w:lang w:val="es-CO"/>
+        </w:rPr>
+        <w:t xml:space="preserve">(2) Ausencia de sparkContext en Serverless. </w:t>
+      </w:r>
+      <w:r>
+        <w:rPr>
+          <w:lang w:val="es-CO"/>
+        </w:rPr>
+        <w:t xml:space="preserve">Databricks Serverless no expone el JVM sparkContext, lo que inhabilita el broadcast de objetos Python. Los UDFs de scoring y segmentación se implementaron con dos patrones: carga desde Volume dentro del UDF para el modelo de propensión (se deserializa una vez por partición Spark) y closures de Python para los objetos ligeros —StandardScaler y KMeans— cuyos artefactos serializados pesan pocos kilobytes.</w:t>
+      </w:r>
+    </w:p>
+    <w:p>
+      <w:pPr>
+        <w:spacing w:after="160" w:line="276" w:lineRule="auto"/>
+        <w:jc w:val="both"/>
+        <w:rPr>
+          <w:lang w:val="es-CO"/>
+        </w:rPr>
+      </w:pPr>
+      <w:r>
+        <w:rPr>
+          <w:b/>
+          <w:lang w:val="es-CO"/>
+        </w:rPr>
+        <w:t xml:space="preserve">(3) Incompatibilidad binaria de NumPy. </w:t>
+      </w:r>
+      <w:r>
+        <w:rPr>
+          <w:lang w:val="es-CO"/>
+        </w:rPr>
+        <w:t xml:space="preserve">El modelo fue entrenado localmente con NumPy 2.x, que introduce el submódulo interno numpy._core; el entorno Databricks tiene NumPy 1.23.5, que no lo incluye. La deserialización con joblib fallaba con ModuleNotFoundError. La solución fue (i) instalar NumPy 1.26.4 —compatible en binario con scikit-learn y SciPy ya compilados para la serie 1.x—, y (ii) registrar un alias de módulo (sys.modules['numpy._core'] = numpy.core y sus subpaquetes) antes de la deserialización, permitiendo que el pickle resuelva las referencias al módulo renombrado.</w:t>
+      </w:r>
+    </w:p>
+    <w:p>
+      <w:pPr>
+        <w:spacing w:after="160" w:line="276" w:lineRule="auto"/>
+        <w:jc w:val="both"/>
+        <w:rPr>
+          <w:lang w:val="es-CO"/>
+        </w:rPr>
+      </w:pPr>
+      <w:r>
+        <w:rPr>
+          <w:lang w:val="es-CO"/>
+        </w:rPr>
+        <w:t xml:space="preserve">Para el tracking de experimentos, MLflow registró los hiperparámetros del modelo final y las métricas del test (PR-AUC = 0.117, PR-AUC ex-Black Friday = 0.112, Brier score = 0.052). El registro en el Model Registry de Unity Catalog se deshabilitó porque el entorno académico institucional no tiene permisos de escritura sobre el almacenamiento gestionado de Unity Catalog en S3; el artefacto quedó registrado directamente en el experimento del workspace, lo que es suficiente para trazabilidad y reproducibilidad en el alcance del proyecto.</w:t>
+      </w:r>
+    </w:p>
+    <w:p>
+      <w:pPr>
+        <w:spacing w:after="160" w:line="276" w:lineRule="auto"/>
+        <w:jc w:val="both"/>
+        <w:rPr>
+          <w:lang w:val="es-CO"/>
+        </w:rPr>
+      </w:pPr>
+      <w:r>
+        <w:rPr>
+          <w:lang w:val="es-CO"/>
+        </w:rPr>
+        <w:t xml:space="preserve">El resultado final es la tabla Delta workspace.default.contrato2 con 19.711.743 filas y cuatro columnas: user_session, prob_calibrada, segmento y segmento_nombre. La distribución por segmento es consistente con el perfil esperado de K-Means: general_bajo_valor 49.8 %, electronica_gama_media 29.5 %, electronica_premium 13.6 %, explorador 7.0 % y anómalo 0.05 %. Esta tabla es el contrato de consumo que alimenta el tablero Power BI (frente de visualización) y la lógica de targeting del A/B test (frente de orquestación).</w:t>
       </w:r>
     </w:p>
     <w:p>

</xml_diff>

<commit_message>
informe: completar entrega_final (autores, link tablero, referencias APA, CV std, validacion scoring)
Autores; enlace publico del tablero; 11 referencias metodologicas en APA + dataset/software con versiones; CV 0.124 ± 0.001 (R4); nota de validacion del modelo cargado en Databricks. Eliminado el duplicado docs/ (ya portado).

Co-Authored-By: Claude Opus 4.8 (1M context) <noreply@anthropic.com>
</commit_message>
<xml_diff>
--- a/entrega_final/Informe_Final_PI_Grupo8_plantilla.docx
+++ b/entrega_final/Informe_Final_PI_Grupo8_plantilla.docx
@@ -124,7 +124,7 @@
               <w:rPr>
                 <w:lang w:val="es-CO"/>
               </w:rPr>
-              <w:t>Kelly [apellido], Sara [apellido], Heider Zapata, Yeison [apellido]</w:t>
+              <w:t>Kelly Henrriquez, Sara Martinez, Heider Zapata, Yeison Londoño</w:t>
             </w:r>
           </w:p>
         </w:tc>
@@ -4394,7 +4394,7 @@
           </w:tcPr>
           <w:p>
             <w:r>
-              <w:t>0.124 (CV)</w:t>
+              <w:t>0.124 ± 0.001 (CV)</w:t>
             </w:r>
           </w:p>
         </w:tc>
@@ -4524,11 +4524,9 @@
         <w:rPr>
           <w:lang w:val="es-CO"/>
         </w:rPr>
-        <w:t xml:space="preserve">HPO con Optuna (TPE bayesiano) optimizando PR-AUC en 5-fold CV. El tuneo llevó el PR-AUC de 0.118 (sin tunear) a 0.124 (tuneado). </w:t>
-      </w:r>
-      <w:r>
-        <w:t>Calibración final con CalibratedClassifierCV.</w:t>
-      </w:r>
+        <w:t>HPO con Optuna (TPE bayesiano) optimizando PR-AUC en 5-fold CV. El tuneo llevó el PR-AUC de 0.118 (sin tunear) a 0.124 (0.1235 ± 0.0014 en CV de 5 folds: baja variabilidad entre folds, no un máximo aislado). Calibración final con CalibratedClassifierCV.</w:t>
+      </w:r>
+      <w:r/>
     </w:p>
     <w:p>
       <w:pPr>
@@ -4929,7 +4927,7 @@
           </w:tcPr>
           <w:p>
             <w:r>
-              <w:t>0.124</w:t>
+              <w:t>0.124 ± 0.001</w:t>
             </w:r>
           </w:p>
         </w:tc>
@@ -7072,7 +7070,7 @@
         <w:rPr>
           <w:lang w:val="es-CO"/>
         </w:rPr>
-        <w:t xml:space="preserve">Para el tracking de experimentos, MLflow registró los hiperparámetros del modelo final y las métricas del test (PR-AUC = 0.117, PR-AUC ex-Black Friday = 0.112, Brier score = 0.052). El registro en el Model Registry de Unity Catalog se deshabilitó porque el entorno académico institucional no tiene permisos de escritura sobre el almacenamiento gestionado de Unity Catalog en S3; el artefacto quedó registrado directamente en el experimento del workspace, lo que es suficiente para trazabilidad y reproducibilidad en el alcance del proyecto.</w:t>
+        <w:t>Para el tracking de experimentos, MLflow registró los hiperparámetros del modelo final y las métricas del test (PR-AUC = 0.117, PR-AUC ex-Black Friday = 0.112, Brier score = 0.052). El registro en el Model Registry de Unity Catalog se deshabilitó porque el entorno académico institucional no tiene permisos de escritura sobre el almacenamiento gestionado de Unity Catalog en S3; el artefacto quedó registrado directamente en el experimento del workspace, lo que es suficiente para trazabilidad y reproducibilidad en el alcance del proyecto. Antes del scoring masivo se validó que el modelo cargado en Databricks reproduce esas métricas sobre el test out-of-time (PR-AUC 0.117, Brier 0.052), garantizando consistencia entre el entrenamiento local y el scoring distribuido.</w:t>
       </w:r>
     </w:p>
     <w:p>
@@ -7446,23 +7444,7 @@
           <w:color w:val="C00000"/>
           <w:lang w:val="es-CO"/>
         </w:rPr>
-        <w:t>[ POR COMPLETAR ] Pegar el enlace público del tablero en Power BI Service.</w:t>
-      </w:r>
-    </w:p>
-    <w:p>
-      <w:pPr>
-        <w:spacing w:after="120"/>
-        <w:rPr>
-          <w:lang w:val="es-CO"/>
-        </w:rPr>
-      </w:pPr>
-      <w:r>
-        <w:rPr>
-          <w:i/>
-          <w:color w:val="C00000"/>
-          <w:lang w:val="es-CO"/>
-        </w:rPr>
-        <w:t>[ POR COMPLETAR ] Integrar el clustering de Sara (segmentos C0–C3) en la página «Análisis de cliente» — el cruce clasificador × clustering, pendiente por Kelly.</w:t>
+        <w:t>Tablero desplegado y accesible públicamente en Power BI Service: https://app.powerbi.com/view?r=eyJrIjoiYWU0MTM5MjUtM2VlMC00ZDgzLThlYzktN2ZmY2M5Yzg4ZTNmIiwidCI6Ijk5ZjdiNTVlLTljYmUtNDY3Yi04MTQzLTkxOTc4MjkxOGFmYiIsImMiOjR9</w:t>
       </w:r>
     </w:p>
     <w:p>
@@ -7703,14 +7685,13 @@
         <w:spacing w:after="80"/>
       </w:pPr>
       <w:r>
-        <w:t xml:space="preserve">Kechinov, M. eCommerce behavior data from multi category store (REES46). Kaggle. </w:t>
+        <w:t>Kechinov, M. (2020). eCommerce behavior data from multi category store (REES46) [Conjunto de datos]. Kaggle. https://www.kaggle.com/datasets/mkechinov/ecommerce-behavior-data-from-multi-category-store</w:t>
       </w:r>
       <w:r>
         <w:rPr>
           <w:i/>
           <w:iCs/>
         </w:rPr>
-        <w:t>[completar URL y fecha de acceso]</w:t>
       </w:r>
     </w:p>
     <w:p>
@@ -7780,17 +7761,17 @@
         <w:spacing w:after="80"/>
       </w:pPr>
       <w:r>
-        <w:t xml:space="preserve">Librerías y herramientas: scikit-learn, LightGBM, XGBoost, Optuna, Apache Spark, Delta Lake, MLflow, Power BI. </w:t>
+        <w:t>Software y librerías: Python 3.11; scikit-learn 1.6.1; LightGBM 4.6.0; XGBoost; Optuna; Apache Spark 3.5 con Delta Lake; MLflow; Power BI.</w:t>
       </w:r>
       <w:r>
         <w:rPr>
           <w:i/>
         </w:rPr>
-        <w:t>[completar versiones y citas APA]</w:t>
-      </w:r>
-    </w:p>
-    <w:p>
-      <w:pPr>
+      </w:r>
+    </w:p>
+    <w:p>
+      <w:pPr>
+        <w:pStyle w:val="ListParagraph"/>
         <w:spacing w:after="120"/>
         <w:rPr>
           <w:lang w:val="es-CO"/>
@@ -7802,7 +7783,87 @@
           <w:color w:val="C00000"/>
           <w:lang w:val="es-CO"/>
         </w:rPr>
-        <w:t>[ POR COMPLETAR ] Completar las referencias en formato APA (PR-AUC, calibración, K-Means y diseño de experimentos).</w:t>
+        <w:t>Chen, T., &amp; Guestrin, C. (2016). XGBoost: A scalable tree boosting system. En Proceedings of the 22nd ACM SIGKDD International Conference on Knowledge Discovery and Data Mining (pp. 785–794). https://doi.org/10.1145/2939672.2939785</w:t>
+      </w:r>
+    </w:p>
+    <w:p>
+      <w:pPr>
+        <w:pStyle w:val="ListParagraph"/>
+      </w:pPr>
+      <w:r>
+        <w:t>Ke, G., Meng, Q., Finley, T., Wang, T., Chen, W., Ma, W., Ye, Q., &amp; Liu, T.-Y. (2017). LightGBM: A highly efficient gradient boosting decision tree. En Advances in Neural Information Processing Systems (Vol. 30, pp. 3146–3154).</w:t>
+      </w:r>
+    </w:p>
+    <w:p>
+      <w:pPr>
+        <w:pStyle w:val="ListParagraph"/>
+      </w:pPr>
+      <w:r>
+        <w:t>Akiba, T., Sano, S., Yanase, T., Ohta, T., &amp; Koyama, M. (2019). Optuna: A next-generation hyperparameter optimization framework. En Proceedings of the 25th ACM SIGKDD (pp. 2623–2631). https://doi.org/10.1145/3292500.3330701</w:t>
+      </w:r>
+    </w:p>
+    <w:p>
+      <w:pPr>
+        <w:pStyle w:val="ListParagraph"/>
+      </w:pPr>
+      <w:r>
+        <w:t>Pedregosa, F., et al. (2011). Scikit-learn: Machine learning in Python. Journal of Machine Learning Research, 12, 2825–2830.</w:t>
+      </w:r>
+    </w:p>
+    <w:p>
+      <w:pPr>
+        <w:pStyle w:val="ListParagraph"/>
+      </w:pPr>
+      <w:r>
+        <w:t>Davis, J., &amp; Goadrich, M. (2006). The relationship between precision-recall and ROC curves. En Proceedings of the 23rd International Conference on Machine Learning (pp. 233–240). https://doi.org/10.1145/1143844.1143874</w:t>
+      </w:r>
+    </w:p>
+    <w:p>
+      <w:pPr>
+        <w:pStyle w:val="ListParagraph"/>
+      </w:pPr>
+      <w:r>
+        <w:t>Niculescu-Mizil, A., &amp; Caruana, R. (2005). Predicting good probabilities with supervised learning. En Proceedings of the 22nd International Conference on Machine Learning (pp. 625–632).</w:t>
+      </w:r>
+    </w:p>
+    <w:p>
+      <w:pPr>
+        <w:pStyle w:val="ListParagraph"/>
+      </w:pPr>
+      <w:r>
+        <w:t>Lloyd, S. P. (1982). Least squares quantization in PCM. IEEE Transactions on Information Theory, 28(2), 129–137.</w:t>
+      </w:r>
+    </w:p>
+    <w:p>
+      <w:pPr>
+        <w:pStyle w:val="ListParagraph"/>
+      </w:pPr>
+      <w:r>
+        <w:t>Ester, M., Kriegel, H.-P., Sander, J., &amp; Xu, X. (1996). A density-based algorithm for discovering clusters in large spatial databases with noise. En Proceedings of KDD-96 (pp. 226–231).</w:t>
+      </w:r>
+    </w:p>
+    <w:p>
+      <w:pPr>
+        <w:pStyle w:val="ListParagraph"/>
+      </w:pPr>
+      <w:r>
+        <w:t>Kohavi, R., Tang, D., &amp; Xu, Y. (2020). Trustworthy online controlled experiments: A practical guide to A/B testing. Cambridge University Press.</w:t>
+      </w:r>
+    </w:p>
+    <w:p>
+      <w:pPr>
+        <w:pStyle w:val="ListParagraph"/>
+      </w:pPr>
+      <w:r>
+        <w:t>Zaharia, M., Xin, R. S., Wendell, P., et al. (2016). Apache Spark: A unified engine for big data processing. Communications of the ACM, 59(11), 56–65. https://doi.org/10.1145/2934664</w:t>
+      </w:r>
+    </w:p>
+    <w:p>
+      <w:pPr>
+        <w:pStyle w:val="ListParagraph"/>
+      </w:pPr>
+      <w:r>
+        <w:t>Armbrust, M., Das, T., Sun, L., et al. (2020). Delta Lake: High-performance ACID table storage over cloud object stores. Proceedings of the VLDB Endowment, 13(12), 3411–3424.</w:t>
       </w:r>
     </w:p>
     <w:sectPr>

</xml_diff>

<commit_message>
cierre frente datos/modelo/informe: Contrato 2 verificado + docx TOC + estado 00
06 ipynb re-corrido (avg prob 0.060); docx con TOC refrescado; docs/00 nota de cierre 9-jun pm.

Co-Authored-By: Claude Opus 4.8 (1M context) <noreply@anthropic.com>
</commit_message>
<xml_diff>
--- a/entrega_final/Informe_Final_PI_Grupo8_plantilla.docx
+++ b/entrega_final/Informe_Final_PI_Grupo8_plantilla.docx
@@ -311,8 +311,9 @@
       <w:pPr>
         <w:pStyle w:val="heading10"/>
       </w:pPr>
-      <w:bookmarkStart w:id="0" w:name="_Toc231856394"/>
-      <w:r>
+      <w:bookmarkStart w:id="0" w:name="_Toc231897034"/>
+      <w:r>
+        <w:lastRenderedPageBreak/>
         <w:t>Contenido</w:t>
       </w:r>
       <w:bookmarkEnd w:id="0"/>
@@ -322,10 +323,10 @@
         <w:alias w:val="Tabla de contenido"/>
         <w:id w:val="993981426"/>
       </w:sdtPr>
-      <w:sdtEndPr/>
       <w:sdtContent>
         <w:p>
           <w:pPr>
+            <w:pStyle w:val="TDC1"/>
             <w:tabs>
               <w:tab w:val="right" w:leader="dot" w:pos="9350"/>
             </w:tabs>
@@ -342,10 +343,10 @@
           <w:r>
             <w:fldChar w:fldCharType="separate"/>
           </w:r>
-          <w:hyperlink w:anchor="_Toc231856394" w:history="1">
-            <w:r>
-              <w:rPr>
-                <w:rStyle w:val="Hyperlink"/>
+          <w:hyperlink w:anchor="_Toc231897034" w:history="1">
+            <w:r>
+              <w:rPr>
+                <w:rStyle w:val="Hipervnculo"/>
                 <w:noProof/>
               </w:rPr>
               <w:t>Contenido</w:t>
@@ -366,7 +367,7 @@
               <w:rPr>
                 <w:noProof/>
               </w:rPr>
-              <w:instrText xml:space="preserve"> PAGEREF _Toc231856394 \h </w:instrText>
+              <w:instrText xml:space="preserve"> PAGEREF _Toc231897034 \h </w:instrText>
             </w:r>
             <w:r>
               <w:rPr>
@@ -395,6 +396,7 @@
         </w:p>
         <w:p>
           <w:pPr>
+            <w:pStyle w:val="TDC1"/>
             <w:tabs>
               <w:tab w:val="right" w:leader="dot" w:pos="9350"/>
             </w:tabs>
@@ -402,11 +404,12 @@
               <w:noProof/>
             </w:rPr>
           </w:pPr>
-          <w:hyperlink w:anchor="_Toc231856395" w:history="1">
-            <w:r>
-              <w:rPr>
-                <w:rStyle w:val="Hyperlink"/>
-                <w:noProof/>
+          <w:hyperlink w:anchor="_Toc231897035" w:history="1">
+            <w:r>
+              <w:rPr>
+                <w:rStyle w:val="Hipervnculo"/>
+                <w:noProof/>
+                <w:lang w:val="es-CO"/>
               </w:rPr>
               <w:t>1. Introducción</w:t>
             </w:r>
@@ -426,7 +429,7 @@
               <w:rPr>
                 <w:noProof/>
               </w:rPr>
-              <w:instrText xml:space="preserve"> PAGEREF _Toc231856395 \h </w:instrText>
+              <w:instrText xml:space="preserve"> PAGEREF _Toc231897035 \h </w:instrText>
             </w:r>
             <w:r>
               <w:rPr>
@@ -455,6 +458,7 @@
         </w:p>
         <w:p>
           <w:pPr>
+            <w:pStyle w:val="TDC1"/>
             <w:tabs>
               <w:tab w:val="right" w:leader="dot" w:pos="9350"/>
             </w:tabs>
@@ -462,11 +466,12 @@
               <w:noProof/>
             </w:rPr>
           </w:pPr>
-          <w:hyperlink w:anchor="_Toc231856396" w:history="1">
-            <w:r>
-              <w:rPr>
-                <w:rStyle w:val="Hyperlink"/>
-                <w:noProof/>
+          <w:hyperlink w:anchor="_Toc231897036" w:history="1">
+            <w:r>
+              <w:rPr>
+                <w:rStyle w:val="Hipervnculo"/>
+                <w:noProof/>
+                <w:lang w:val="es-CO"/>
               </w:rPr>
               <w:t>2. Marco teórico</w:t>
             </w:r>
@@ -486,7 +491,7 @@
               <w:rPr>
                 <w:noProof/>
               </w:rPr>
-              <w:instrText xml:space="preserve"> PAGEREF _Toc231856396 \h </w:instrText>
+              <w:instrText xml:space="preserve"> PAGEREF _Toc231897036 \h </w:instrText>
             </w:r>
             <w:r>
               <w:rPr>
@@ -515,6 +520,7 @@
         </w:p>
         <w:p>
           <w:pPr>
+            <w:pStyle w:val="TDC2"/>
             <w:tabs>
               <w:tab w:val="right" w:leader="dot" w:pos="9350"/>
             </w:tabs>
@@ -522,11 +528,12 @@
               <w:noProof/>
             </w:rPr>
           </w:pPr>
-          <w:hyperlink w:anchor="_Toc231856397" w:history="1">
-            <w:r>
-              <w:rPr>
-                <w:rStyle w:val="Hyperlink"/>
-                <w:noProof/>
+          <w:hyperlink w:anchor="_Toc231897037" w:history="1">
+            <w:r>
+              <w:rPr>
+                <w:rStyle w:val="Hipervnculo"/>
+                <w:noProof/>
+                <w:lang w:val="es-CO"/>
               </w:rPr>
               <w:t>2.1 Clasificación supervisada sobre eventos raros</w:t>
             </w:r>
@@ -546,7 +553,7 @@
               <w:rPr>
                 <w:noProof/>
               </w:rPr>
-              <w:instrText xml:space="preserve"> PAGEREF _Toc231856397 \h </w:instrText>
+              <w:instrText xml:space="preserve"> PAGEREF _Toc231897037 \h </w:instrText>
             </w:r>
             <w:r>
               <w:rPr>
@@ -575,6 +582,7 @@
         </w:p>
         <w:p>
           <w:pPr>
+            <w:pStyle w:val="TDC2"/>
             <w:tabs>
               <w:tab w:val="right" w:leader="dot" w:pos="9350"/>
             </w:tabs>
@@ -582,11 +590,12 @@
               <w:noProof/>
             </w:rPr>
           </w:pPr>
-          <w:hyperlink w:anchor="_Toc231856398" w:history="1">
-            <w:r>
-              <w:rPr>
-                <w:rStyle w:val="Hyperlink"/>
-                <w:noProof/>
+          <w:hyperlink w:anchor="_Toc231897038" w:history="1">
+            <w:r>
+              <w:rPr>
+                <w:rStyle w:val="Hipervnculo"/>
+                <w:noProof/>
+                <w:lang w:val="es-CO"/>
               </w:rPr>
               <w:t>2.2 Validación que respeta el tiempo y anti-fuga</w:t>
             </w:r>
@@ -606,7 +615,7 @@
               <w:rPr>
                 <w:noProof/>
               </w:rPr>
-              <w:instrText xml:space="preserve"> PAGEREF _Toc231856398 \h </w:instrText>
+              <w:instrText xml:space="preserve"> PAGEREF _Toc231897038 \h </w:instrText>
             </w:r>
             <w:r>
               <w:rPr>
@@ -635,6 +644,7 @@
         </w:p>
         <w:p>
           <w:pPr>
+            <w:pStyle w:val="TDC2"/>
             <w:tabs>
               <w:tab w:val="right" w:leader="dot" w:pos="9350"/>
             </w:tabs>
@@ -642,11 +652,12 @@
               <w:noProof/>
             </w:rPr>
           </w:pPr>
-          <w:hyperlink w:anchor="_Toc231856399" w:history="1">
-            <w:r>
-              <w:rPr>
-                <w:rStyle w:val="Hyperlink"/>
-                <w:noProof/>
+          <w:hyperlink w:anchor="_Toc231897039" w:history="1">
+            <w:r>
+              <w:rPr>
+                <w:rStyle w:val="Hipervnculo"/>
+                <w:noProof/>
+                <w:lang w:val="es-CO"/>
               </w:rPr>
               <w:t>2.3 Árboles, ensembles y boosting</w:t>
             </w:r>
@@ -666,7 +677,7 @@
               <w:rPr>
                 <w:noProof/>
               </w:rPr>
-              <w:instrText xml:space="preserve"> PAGEREF _Toc231856399 \h </w:instrText>
+              <w:instrText xml:space="preserve"> PAGEREF _Toc231897039 \h </w:instrText>
             </w:r>
             <w:r>
               <w:rPr>
@@ -695,6 +706,7 @@
         </w:p>
         <w:p>
           <w:pPr>
+            <w:pStyle w:val="TDC2"/>
             <w:tabs>
               <w:tab w:val="right" w:leader="dot" w:pos="9350"/>
             </w:tabs>
@@ -702,11 +714,12 @@
               <w:noProof/>
             </w:rPr>
           </w:pPr>
-          <w:hyperlink w:anchor="_Toc231856400" w:history="1">
-            <w:r>
-              <w:rPr>
-                <w:rStyle w:val="Hyperlink"/>
-                <w:noProof/>
+          <w:hyperlink w:anchor="_Toc231897040" w:history="1">
+            <w:r>
+              <w:rPr>
+                <w:rStyle w:val="Hipervnculo"/>
+                <w:noProof/>
+                <w:lang w:val="es-CO"/>
               </w:rPr>
               <w:t>2.4 Aprendizaje no supervisado: clustering</w:t>
             </w:r>
@@ -726,7 +739,7 @@
               <w:rPr>
                 <w:noProof/>
               </w:rPr>
-              <w:instrText xml:space="preserve"> PAGEREF _Toc231856400 \h </w:instrText>
+              <w:instrText xml:space="preserve"> PAGEREF _Toc231897040 \h </w:instrText>
             </w:r>
             <w:r>
               <w:rPr>
@@ -755,6 +768,7 @@
         </w:p>
         <w:p>
           <w:pPr>
+            <w:pStyle w:val="TDC2"/>
             <w:tabs>
               <w:tab w:val="right" w:leader="dot" w:pos="9350"/>
             </w:tabs>
@@ -762,11 +776,12 @@
               <w:noProof/>
             </w:rPr>
           </w:pPr>
-          <w:hyperlink w:anchor="_Toc231856401" w:history="1">
-            <w:r>
-              <w:rPr>
-                <w:rStyle w:val="Hyperlink"/>
-                <w:noProof/>
+          <w:hyperlink w:anchor="_Toc231897041" w:history="1">
+            <w:r>
+              <w:rPr>
+                <w:rStyle w:val="Hipervnculo"/>
+                <w:noProof/>
+                <w:lang w:val="es-CO"/>
               </w:rPr>
               <w:t>2.5 Diseño experimental: propensión ≠ uplift</w:t>
             </w:r>
@@ -786,7 +801,7 @@
               <w:rPr>
                 <w:noProof/>
               </w:rPr>
-              <w:instrText xml:space="preserve"> PAGEREF _Toc231856401 \h </w:instrText>
+              <w:instrText xml:space="preserve"> PAGEREF _Toc231897041 \h </w:instrText>
             </w:r>
             <w:r>
               <w:rPr>
@@ -815,6 +830,7 @@
         </w:p>
         <w:p>
           <w:pPr>
+            <w:pStyle w:val="TDC2"/>
             <w:tabs>
               <w:tab w:val="right" w:leader="dot" w:pos="9350"/>
             </w:tabs>
@@ -822,11 +838,12 @@
               <w:noProof/>
             </w:rPr>
           </w:pPr>
-          <w:hyperlink w:anchor="_Toc231856402" w:history="1">
-            <w:r>
-              <w:rPr>
-                <w:rStyle w:val="Hyperlink"/>
-                <w:noProof/>
+          <w:hyperlink w:anchor="_Toc231897042" w:history="1">
+            <w:r>
+              <w:rPr>
+                <w:rStyle w:val="Hipervnculo"/>
+                <w:noProof/>
+                <w:lang w:val="es-CO"/>
               </w:rPr>
               <w:t>2.6 Arquitectura de grandes datos</w:t>
             </w:r>
@@ -846,7 +863,7 @@
               <w:rPr>
                 <w:noProof/>
               </w:rPr>
-              <w:instrText xml:space="preserve"> PAGEREF _Toc231856402 \h </w:instrText>
+              <w:instrText xml:space="preserve"> PAGEREF _Toc231897042 \h </w:instrText>
             </w:r>
             <w:r>
               <w:rPr>
@@ -875,6 +892,7 @@
         </w:p>
         <w:p>
           <w:pPr>
+            <w:pStyle w:val="TDC2"/>
             <w:tabs>
               <w:tab w:val="right" w:leader="dot" w:pos="9350"/>
             </w:tabs>
@@ -882,11 +900,12 @@
               <w:noProof/>
             </w:rPr>
           </w:pPr>
-          <w:hyperlink w:anchor="_Toc231856403" w:history="1">
-            <w:r>
-              <w:rPr>
-                <w:rStyle w:val="Hyperlink"/>
-                <w:noProof/>
+          <w:hyperlink w:anchor="_Toc231897043" w:history="1">
+            <w:r>
+              <w:rPr>
+                <w:rStyle w:val="Hipervnculo"/>
+                <w:noProof/>
+                <w:lang w:val="es-CO"/>
               </w:rPr>
               <w:t>2.7 Visualización y comunicación</w:t>
             </w:r>
@@ -906,7 +925,7 @@
               <w:rPr>
                 <w:noProof/>
               </w:rPr>
-              <w:instrText xml:space="preserve"> PAGEREF _Toc231856403 \h </w:instrText>
+              <w:instrText xml:space="preserve"> PAGEREF _Toc231897043 \h </w:instrText>
             </w:r>
             <w:r>
               <w:rPr>
@@ -935,6 +954,7 @@
         </w:p>
         <w:p>
           <w:pPr>
+            <w:pStyle w:val="TDC1"/>
             <w:tabs>
               <w:tab w:val="right" w:leader="dot" w:pos="9350"/>
             </w:tabs>
@@ -942,11 +962,12 @@
               <w:noProof/>
             </w:rPr>
           </w:pPr>
-          <w:hyperlink w:anchor="_Toc231856404" w:history="1">
-            <w:r>
-              <w:rPr>
-                <w:rStyle w:val="Hyperlink"/>
-                <w:noProof/>
+          <w:hyperlink w:anchor="_Toc231897044" w:history="1">
+            <w:r>
+              <w:rPr>
+                <w:rStyle w:val="Hipervnculo"/>
+                <w:noProof/>
+                <w:lang w:val="es-CO"/>
               </w:rPr>
               <w:t>3. Desarrollo metodológico de modelos de Machine Learning</w:t>
             </w:r>
@@ -966,7 +987,7 @@
               <w:rPr>
                 <w:noProof/>
               </w:rPr>
-              <w:instrText xml:space="preserve"> PAGEREF _Toc231856404 \h </w:instrText>
+              <w:instrText xml:space="preserve"> PAGEREF _Toc231897044 \h </w:instrText>
             </w:r>
             <w:r>
               <w:rPr>
@@ -995,6 +1016,7 @@
         </w:p>
         <w:p>
           <w:pPr>
+            <w:pStyle w:val="TDC2"/>
             <w:tabs>
               <w:tab w:val="right" w:leader="dot" w:pos="9350"/>
             </w:tabs>
@@ -1002,11 +1024,12 @@
               <w:noProof/>
             </w:rPr>
           </w:pPr>
-          <w:hyperlink w:anchor="_Toc231856405" w:history="1">
-            <w:r>
-              <w:rPr>
-                <w:rStyle w:val="Hyperlink"/>
-                <w:noProof/>
+          <w:hyperlink w:anchor="_Toc231897045" w:history="1">
+            <w:r>
+              <w:rPr>
+                <w:rStyle w:val="Hipervnculo"/>
+                <w:noProof/>
+                <w:lang w:val="es-CO"/>
               </w:rPr>
               <w:t>3.1 Entendimiento del problema, pregunta de negocio e hipótesis</w:t>
             </w:r>
@@ -1026,7 +1049,7 @@
               <w:rPr>
                 <w:noProof/>
               </w:rPr>
-              <w:instrText xml:space="preserve"> PAGEREF _Toc231856405 \h </w:instrText>
+              <w:instrText xml:space="preserve"> PAGEREF _Toc231897045 \h </w:instrText>
             </w:r>
             <w:r>
               <w:rPr>
@@ -1055,6 +1078,7 @@
         </w:p>
         <w:p>
           <w:pPr>
+            <w:pStyle w:val="TDC2"/>
             <w:tabs>
               <w:tab w:val="right" w:leader="dot" w:pos="9350"/>
             </w:tabs>
@@ -1062,11 +1086,12 @@
               <w:noProof/>
             </w:rPr>
           </w:pPr>
-          <w:hyperlink w:anchor="_Toc231856406" w:history="1">
-            <w:r>
-              <w:rPr>
-                <w:rStyle w:val="Hyperlink"/>
-                <w:noProof/>
+          <w:hyperlink w:anchor="_Toc231897046" w:history="1">
+            <w:r>
+              <w:rPr>
+                <w:rStyle w:val="Hipervnculo"/>
+                <w:noProof/>
+                <w:lang w:val="es-CO"/>
               </w:rPr>
               <w:t>3.2 Análisis Exploratorio de Datos (EDA)</w:t>
             </w:r>
@@ -1086,7 +1111,7 @@
               <w:rPr>
                 <w:noProof/>
               </w:rPr>
-              <w:instrText xml:space="preserve"> PAGEREF _Toc231856406 \h </w:instrText>
+              <w:instrText xml:space="preserve"> PAGEREF _Toc231897046 \h </w:instrText>
             </w:r>
             <w:r>
               <w:rPr>
@@ -1115,6 +1140,7 @@
         </w:p>
         <w:p>
           <w:pPr>
+            <w:pStyle w:val="TDC3"/>
             <w:tabs>
               <w:tab w:val="right" w:leader="dot" w:pos="9350"/>
             </w:tabs>
@@ -1122,11 +1148,12 @@
               <w:noProof/>
             </w:rPr>
           </w:pPr>
-          <w:hyperlink w:anchor="_Toc231856407" w:history="1">
-            <w:r>
-              <w:rPr>
-                <w:rStyle w:val="Hyperlink"/>
-                <w:noProof/>
+          <w:hyperlink w:anchor="_Toc231897047" w:history="1">
+            <w:r>
+              <w:rPr>
+                <w:rStyle w:val="Hipervnculo"/>
+                <w:noProof/>
+                <w:lang w:val="es-CO"/>
               </w:rPr>
               <w:t>3.2.1 Entendimiento de los datos</w:t>
             </w:r>
@@ -1146,7 +1173,7 @@
               <w:rPr>
                 <w:noProof/>
               </w:rPr>
-              <w:instrText xml:space="preserve"> PAGEREF _Toc231856407 \h </w:instrText>
+              <w:instrText xml:space="preserve"> PAGEREF _Toc231897047 \h </w:instrText>
             </w:r>
             <w:r>
               <w:rPr>
@@ -1175,6 +1202,7 @@
         </w:p>
         <w:p>
           <w:pPr>
+            <w:pStyle w:val="TDC3"/>
             <w:tabs>
               <w:tab w:val="right" w:leader="dot" w:pos="9350"/>
             </w:tabs>
@@ -1182,11 +1210,12 @@
               <w:noProof/>
             </w:rPr>
           </w:pPr>
-          <w:hyperlink w:anchor="_Toc231856408" w:history="1">
-            <w:r>
-              <w:rPr>
-                <w:rStyle w:val="Hyperlink"/>
-                <w:noProof/>
+          <w:hyperlink w:anchor="_Toc231897048" w:history="1">
+            <w:r>
+              <w:rPr>
+                <w:rStyle w:val="Hipervnculo"/>
+                <w:noProof/>
+                <w:lang w:val="es-CO"/>
               </w:rPr>
               <w:t>3.2.2 Preparación de los datos</w:t>
             </w:r>
@@ -1206,7 +1235,7 @@
               <w:rPr>
                 <w:noProof/>
               </w:rPr>
-              <w:instrText xml:space="preserve"> PAGEREF _Toc231856408 \h </w:instrText>
+              <w:instrText xml:space="preserve"> PAGEREF _Toc231897048 \h </w:instrText>
             </w:r>
             <w:r>
               <w:rPr>
@@ -1235,6 +1264,7 @@
         </w:p>
         <w:p>
           <w:pPr>
+            <w:pStyle w:val="TDC3"/>
             <w:tabs>
               <w:tab w:val="right" w:leader="dot" w:pos="9350"/>
             </w:tabs>
@@ -1242,11 +1272,12 @@
               <w:noProof/>
             </w:rPr>
           </w:pPr>
-          <w:hyperlink w:anchor="_Toc231856409" w:history="1">
-            <w:r>
-              <w:rPr>
-                <w:rStyle w:val="Hyperlink"/>
-                <w:noProof/>
+          <w:hyperlink w:anchor="_Toc231897049" w:history="1">
+            <w:r>
+              <w:rPr>
+                <w:rStyle w:val="Hipervnculo"/>
+                <w:noProof/>
+                <w:lang w:val="es-CO"/>
               </w:rPr>
               <w:t>3.2.3 Análisis descriptivo e insights</w:t>
             </w:r>
@@ -1266,7 +1297,7 @@
               <w:rPr>
                 <w:noProof/>
               </w:rPr>
-              <w:instrText xml:space="preserve"> PAGEREF _Toc231856409 \h </w:instrText>
+              <w:instrText xml:space="preserve"> PAGEREF _Toc231897049 \h </w:instrText>
             </w:r>
             <w:r>
               <w:rPr>
@@ -1295,6 +1326,7 @@
         </w:p>
         <w:p>
           <w:pPr>
+            <w:pStyle w:val="TDC2"/>
             <w:tabs>
               <w:tab w:val="right" w:leader="dot" w:pos="9350"/>
             </w:tabs>
@@ -1302,11 +1334,12 @@
               <w:noProof/>
             </w:rPr>
           </w:pPr>
-          <w:hyperlink w:anchor="_Toc231856410" w:history="1">
-            <w:r>
-              <w:rPr>
-                <w:rStyle w:val="Hyperlink"/>
-                <w:noProof/>
+          <w:hyperlink w:anchor="_Toc231897050" w:history="1">
+            <w:r>
+              <w:rPr>
+                <w:rStyle w:val="Hipervnculo"/>
+                <w:noProof/>
+                <w:lang w:val="es-CO"/>
               </w:rPr>
               <w:t>3.3 Selección de modelos, ingeniería de características, entrenamiento y evaluación</w:t>
             </w:r>
@@ -1326,7 +1359,7 @@
               <w:rPr>
                 <w:noProof/>
               </w:rPr>
-              <w:instrText xml:space="preserve"> PAGEREF _Toc231856410 \h </w:instrText>
+              <w:instrText xml:space="preserve"> PAGEREF _Toc231897050 \h </w:instrText>
             </w:r>
             <w:r>
               <w:rPr>
@@ -1355,6 +1388,7 @@
         </w:p>
         <w:p>
           <w:pPr>
+            <w:pStyle w:val="TDC3"/>
             <w:tabs>
               <w:tab w:val="right" w:leader="dot" w:pos="9350"/>
             </w:tabs>
@@ -1362,11 +1396,12 @@
               <w:noProof/>
             </w:rPr>
           </w:pPr>
-          <w:hyperlink w:anchor="_Toc231856411" w:history="1">
-            <w:r>
-              <w:rPr>
-                <w:rStyle w:val="Hyperlink"/>
-                <w:noProof/>
+          <w:hyperlink w:anchor="_Toc231897051" w:history="1">
+            <w:r>
+              <w:rPr>
+                <w:rStyle w:val="Hipervnculo"/>
+                <w:noProof/>
+                <w:lang w:val="es-CO"/>
               </w:rPr>
               <w:t>3.3.1 Características e ingeniería de características</w:t>
             </w:r>
@@ -1386,7 +1421,7 @@
               <w:rPr>
                 <w:noProof/>
               </w:rPr>
-              <w:instrText xml:space="preserve"> PAGEREF _Toc231856411 \h </w:instrText>
+              <w:instrText xml:space="preserve"> PAGEREF _Toc231897051 \h </w:instrText>
             </w:r>
             <w:r>
               <w:rPr>
@@ -1415,6 +1450,7 @@
         </w:p>
         <w:p>
           <w:pPr>
+            <w:pStyle w:val="TDC3"/>
             <w:tabs>
               <w:tab w:val="right" w:leader="dot" w:pos="9350"/>
             </w:tabs>
@@ -1422,11 +1458,12 @@
               <w:noProof/>
             </w:rPr>
           </w:pPr>
-          <w:hyperlink w:anchor="_Toc231856412" w:history="1">
-            <w:r>
-              <w:rPr>
-                <w:rStyle w:val="Hyperlink"/>
-                <w:noProof/>
+          <w:hyperlink w:anchor="_Toc231897052" w:history="1">
+            <w:r>
+              <w:rPr>
+                <w:rStyle w:val="Hipervnculo"/>
+                <w:noProof/>
+                <w:lang w:val="es-CO"/>
               </w:rPr>
               <w:t>3.3.2 Modelos (selección)</w:t>
             </w:r>
@@ -1446,7 +1483,7 @@
               <w:rPr>
                 <w:noProof/>
               </w:rPr>
-              <w:instrText xml:space="preserve"> PAGEREF _Toc231856412 \h </w:instrText>
+              <w:instrText xml:space="preserve"> PAGEREF _Toc231897052 \h </w:instrText>
             </w:r>
             <w:r>
               <w:rPr>
@@ -1475,6 +1512,7 @@
         </w:p>
         <w:p>
           <w:pPr>
+            <w:pStyle w:val="TDC3"/>
             <w:tabs>
               <w:tab w:val="right" w:leader="dot" w:pos="9350"/>
             </w:tabs>
@@ -1482,10 +1520,10 @@
               <w:noProof/>
             </w:rPr>
           </w:pPr>
-          <w:hyperlink w:anchor="_Toc231856413" w:history="1">
-            <w:r>
-              <w:rPr>
-                <w:rStyle w:val="Hyperlink"/>
+          <w:hyperlink w:anchor="_Toc231897053" w:history="1">
+            <w:r>
+              <w:rPr>
+                <w:rStyle w:val="Hipervnculo"/>
                 <w:noProof/>
               </w:rPr>
               <w:t>3.3.3 Entrenamiento</w:t>
@@ -1506,7 +1544,7 @@
               <w:rPr>
                 <w:noProof/>
               </w:rPr>
-              <w:instrText xml:space="preserve"> PAGEREF _Toc231856413 \h </w:instrText>
+              <w:instrText xml:space="preserve"> PAGEREF _Toc231897053 \h </w:instrText>
             </w:r>
             <w:r>
               <w:rPr>
@@ -1535,6 +1573,7 @@
         </w:p>
         <w:p>
           <w:pPr>
+            <w:pStyle w:val="TDC3"/>
             <w:tabs>
               <w:tab w:val="right" w:leader="dot" w:pos="9350"/>
             </w:tabs>
@@ -1542,10 +1581,10 @@
               <w:noProof/>
             </w:rPr>
           </w:pPr>
-          <w:hyperlink w:anchor="_Toc231856414" w:history="1">
-            <w:r>
-              <w:rPr>
-                <w:rStyle w:val="Hyperlink"/>
+          <w:hyperlink w:anchor="_Toc231897054" w:history="1">
+            <w:r>
+              <w:rPr>
+                <w:rStyle w:val="Hipervnculo"/>
                 <w:noProof/>
               </w:rPr>
               <w:t>3.3.4 Evaluación</w:t>
@@ -1566,7 +1605,7 @@
               <w:rPr>
                 <w:noProof/>
               </w:rPr>
-              <w:instrText xml:space="preserve"> PAGEREF _Toc231856414 \h </w:instrText>
+              <w:instrText xml:space="preserve"> PAGEREF _Toc231897054 \h </w:instrText>
             </w:r>
             <w:r>
               <w:rPr>
@@ -1595,6 +1634,7 @@
         </w:p>
         <w:p>
           <w:pPr>
+            <w:pStyle w:val="TDC2"/>
             <w:tabs>
               <w:tab w:val="right" w:leader="dot" w:pos="9350"/>
             </w:tabs>
@@ -1602,11 +1642,12 @@
               <w:noProof/>
             </w:rPr>
           </w:pPr>
-          <w:hyperlink w:anchor="_Toc231856415" w:history="1">
-            <w:r>
-              <w:rPr>
-                <w:rStyle w:val="Hyperlink"/>
-                <w:noProof/>
+          <w:hyperlink w:anchor="_Toc231897055" w:history="1">
+            <w:r>
+              <w:rPr>
+                <w:rStyle w:val="Hipervnculo"/>
+                <w:noProof/>
+                <w:lang w:val="es-CO"/>
               </w:rPr>
               <w:t>3.4 Análisis y conclusiones del componente de ML</w:t>
             </w:r>
@@ -1626,7 +1667,7 @@
               <w:rPr>
                 <w:noProof/>
               </w:rPr>
-              <w:instrText xml:space="preserve"> PAGEREF _Toc231856415 \h </w:instrText>
+              <w:instrText xml:space="preserve"> PAGEREF _Toc231897055 \h </w:instrText>
             </w:r>
             <w:r>
               <w:rPr>
@@ -1655,6 +1696,7 @@
         </w:p>
         <w:p>
           <w:pPr>
+            <w:pStyle w:val="TDC2"/>
             <w:tabs>
               <w:tab w:val="right" w:leader="dot" w:pos="9350"/>
             </w:tabs>
@@ -1662,11 +1704,12 @@
               <w:noProof/>
             </w:rPr>
           </w:pPr>
-          <w:hyperlink w:anchor="_Toc231856416" w:history="1">
-            <w:r>
-              <w:rPr>
-                <w:rStyle w:val="Hyperlink"/>
-                <w:noProof/>
+          <w:hyperlink w:anchor="_Toc231897056" w:history="1">
+            <w:r>
+              <w:rPr>
+                <w:rStyle w:val="Hipervnculo"/>
+                <w:noProof/>
+                <w:lang w:val="es-CO"/>
               </w:rPr>
               <w:t>3.5 Cierre del alcance: diseño del A/B test</w:t>
             </w:r>
@@ -1686,7 +1729,7 @@
               <w:rPr>
                 <w:noProof/>
               </w:rPr>
-              <w:instrText xml:space="preserve"> PAGEREF _Toc231856416 \h </w:instrText>
+              <w:instrText xml:space="preserve"> PAGEREF _Toc231897056 \h </w:instrText>
             </w:r>
             <w:r>
               <w:rPr>
@@ -1715,6 +1758,7 @@
         </w:p>
         <w:p>
           <w:pPr>
+            <w:pStyle w:val="TDC3"/>
             <w:tabs>
               <w:tab w:val="right" w:leader="dot" w:pos="9350"/>
             </w:tabs>
@@ -1722,11 +1766,12 @@
               <w:noProof/>
             </w:rPr>
           </w:pPr>
-          <w:hyperlink w:anchor="_Toc231856417" w:history="1">
-            <w:r>
-              <w:rPr>
-                <w:rStyle w:val="Hyperlink"/>
-                <w:noProof/>
+          <w:hyperlink w:anchor="_Toc231897057" w:history="1">
+            <w:r>
+              <w:rPr>
+                <w:rStyle w:val="Hipervnculo"/>
+                <w:noProof/>
+                <w:lang w:val="es-CO"/>
               </w:rPr>
               <w:t>3.5.1 Por qué un diseño de A/B y no una estimación de uplift</w:t>
             </w:r>
@@ -1746,7 +1791,7 @@
               <w:rPr>
                 <w:noProof/>
               </w:rPr>
-              <w:instrText xml:space="preserve"> PAGEREF _Toc231856417 \h </w:instrText>
+              <w:instrText xml:space="preserve"> PAGEREF _Toc231897057 \h </w:instrText>
             </w:r>
             <w:r>
               <w:rPr>
@@ -1775,6 +1820,7 @@
         </w:p>
         <w:p>
           <w:pPr>
+            <w:pStyle w:val="TDC3"/>
             <w:tabs>
               <w:tab w:val="right" w:leader="dot" w:pos="9350"/>
             </w:tabs>
@@ -1782,11 +1828,12 @@
               <w:noProof/>
             </w:rPr>
           </w:pPr>
-          <w:hyperlink w:anchor="_Toc231856418" w:history="1">
-            <w:r>
-              <w:rPr>
-                <w:rStyle w:val="Hyperlink"/>
-                <w:noProof/>
+          <w:hyperlink w:anchor="_Toc231897058" w:history="1">
+            <w:r>
+              <w:rPr>
+                <w:rStyle w:val="Hipervnculo"/>
+                <w:noProof/>
+                <w:lang w:val="es-CO"/>
               </w:rPr>
               <w:t>3.5.2 Objetivo e hipótesis</w:t>
             </w:r>
@@ -1806,7 +1853,7 @@
               <w:rPr>
                 <w:noProof/>
               </w:rPr>
-              <w:instrText xml:space="preserve"> PAGEREF _Toc231856418 \h </w:instrText>
+              <w:instrText xml:space="preserve"> PAGEREF _Toc231897058 \h </w:instrText>
             </w:r>
             <w:r>
               <w:rPr>
@@ -1835,6 +1882,7 @@
         </w:p>
         <w:p>
           <w:pPr>
+            <w:pStyle w:val="TDC3"/>
             <w:tabs>
               <w:tab w:val="right" w:leader="dot" w:pos="9350"/>
             </w:tabs>
@@ -1842,11 +1890,12 @@
               <w:noProof/>
             </w:rPr>
           </w:pPr>
-          <w:hyperlink w:anchor="_Toc231856419" w:history="1">
-            <w:r>
-              <w:rPr>
-                <w:rStyle w:val="Hyperlink"/>
-                <w:noProof/>
+          <w:hyperlink w:anchor="_Toc231897059" w:history="1">
+            <w:r>
+              <w:rPr>
+                <w:rStyle w:val="Hipervnculo"/>
+                <w:noProof/>
+                <w:lang w:val="es-CO"/>
               </w:rPr>
               <w:t>3.5.3 Población objetivo y targeting con el modelo</w:t>
             </w:r>
@@ -1866,7 +1915,7 @@
               <w:rPr>
                 <w:noProof/>
               </w:rPr>
-              <w:instrText xml:space="preserve"> PAGEREF _Toc231856419 \h </w:instrText>
+              <w:instrText xml:space="preserve"> PAGEREF _Toc231897059 \h </w:instrText>
             </w:r>
             <w:r>
               <w:rPr>
@@ -1895,6 +1944,7 @@
         </w:p>
         <w:p>
           <w:pPr>
+            <w:pStyle w:val="TDC3"/>
             <w:tabs>
               <w:tab w:val="right" w:leader="dot" w:pos="9350"/>
             </w:tabs>
@@ -1902,10 +1952,10 @@
               <w:noProof/>
             </w:rPr>
           </w:pPr>
-          <w:hyperlink w:anchor="_Toc231856420" w:history="1">
-            <w:r>
-              <w:rPr>
-                <w:rStyle w:val="Hyperlink"/>
+          <w:hyperlink w:anchor="_Toc231897060" w:history="1">
+            <w:r>
+              <w:rPr>
+                <w:rStyle w:val="Hipervnculo"/>
                 <w:noProof/>
               </w:rPr>
               <w:t>3.5.4 Unidad de aleatorización y asignación</w:t>
@@ -1926,7 +1976,7 @@
               <w:rPr>
                 <w:noProof/>
               </w:rPr>
-              <w:instrText xml:space="preserve"> PAGEREF _Toc231856420 \h </w:instrText>
+              <w:instrText xml:space="preserve"> PAGEREF _Toc231897060 \h </w:instrText>
             </w:r>
             <w:r>
               <w:rPr>
@@ -1955,6 +2005,7 @@
         </w:p>
         <w:p>
           <w:pPr>
+            <w:pStyle w:val="TDC3"/>
             <w:tabs>
               <w:tab w:val="right" w:leader="dot" w:pos="9350"/>
             </w:tabs>
@@ -1962,10 +2013,10 @@
               <w:noProof/>
             </w:rPr>
           </w:pPr>
-          <w:hyperlink w:anchor="_Toc231856421" w:history="1">
-            <w:r>
-              <w:rPr>
-                <w:rStyle w:val="Hyperlink"/>
+          <w:hyperlink w:anchor="_Toc231897061" w:history="1">
+            <w:r>
+              <w:rPr>
+                <w:rStyle w:val="Hipervnculo"/>
                 <w:noProof/>
               </w:rPr>
               <w:t>3.5.5 Métricas</w:t>
@@ -1986,7 +2037,7 @@
               <w:rPr>
                 <w:noProof/>
               </w:rPr>
-              <w:instrText xml:space="preserve"> PAGEREF _Toc231856421 \h </w:instrText>
+              <w:instrText xml:space="preserve"> PAGEREF _Toc231897061 \h </w:instrText>
             </w:r>
             <w:r>
               <w:rPr>
@@ -2015,6 +2066,7 @@
         </w:p>
         <w:p>
           <w:pPr>
+            <w:pStyle w:val="TDC3"/>
             <w:tabs>
               <w:tab w:val="right" w:leader="dot" w:pos="9350"/>
             </w:tabs>
@@ -2022,11 +2074,12 @@
               <w:noProof/>
             </w:rPr>
           </w:pPr>
-          <w:hyperlink w:anchor="_Toc231856422" w:history="1">
-            <w:r>
-              <w:rPr>
-                <w:rStyle w:val="Hyperlink"/>
-                <w:noProof/>
+          <w:hyperlink w:anchor="_Toc231897062" w:history="1">
+            <w:r>
+              <w:rPr>
+                <w:rStyle w:val="Hipervnculo"/>
+                <w:noProof/>
+                <w:lang w:val="es-CO"/>
               </w:rPr>
               <w:t>3.5.6 Tamaño de muestra, MDE y duración</w:t>
             </w:r>
@@ -2046,7 +2099,7 @@
               <w:rPr>
                 <w:noProof/>
               </w:rPr>
-              <w:instrText xml:space="preserve"> PAGEREF _Toc231856422 \h </w:instrText>
+              <w:instrText xml:space="preserve"> PAGEREF _Toc231897062 \h </w:instrText>
             </w:r>
             <w:r>
               <w:rPr>
@@ -2075,6 +2128,7 @@
         </w:p>
         <w:p>
           <w:pPr>
+            <w:pStyle w:val="TDC3"/>
             <w:tabs>
               <w:tab w:val="right" w:leader="dot" w:pos="9350"/>
             </w:tabs>
@@ -2082,11 +2136,12 @@
               <w:noProof/>
             </w:rPr>
           </w:pPr>
-          <w:hyperlink w:anchor="_Toc231856423" w:history="1">
-            <w:r>
-              <w:rPr>
-                <w:rStyle w:val="Hyperlink"/>
-                <w:noProof/>
+          <w:hyperlink w:anchor="_Toc231897063" w:history="1">
+            <w:r>
+              <w:rPr>
+                <w:rStyle w:val="Hipervnculo"/>
+                <w:noProof/>
+                <w:lang w:val="es-CO"/>
               </w:rPr>
               <w:t>3.5.7 Regla de decisión y análisis</w:t>
             </w:r>
@@ -2106,7 +2161,7 @@
               <w:rPr>
                 <w:noProof/>
               </w:rPr>
-              <w:instrText xml:space="preserve"> PAGEREF _Toc231856423 \h </w:instrText>
+              <w:instrText xml:space="preserve"> PAGEREF _Toc231897063 \h </w:instrText>
             </w:r>
             <w:r>
               <w:rPr>
@@ -2135,6 +2190,7 @@
         </w:p>
         <w:p>
           <w:pPr>
+            <w:pStyle w:val="TDC1"/>
             <w:tabs>
               <w:tab w:val="right" w:leader="dot" w:pos="9350"/>
             </w:tabs>
@@ -2142,11 +2198,12 @@
               <w:noProof/>
             </w:rPr>
           </w:pPr>
-          <w:hyperlink w:anchor="_Toc231856424" w:history="1">
-            <w:r>
-              <w:rPr>
-                <w:rStyle w:val="Hyperlink"/>
-                <w:noProof/>
+          <w:hyperlink w:anchor="_Toc231897064" w:history="1">
+            <w:r>
+              <w:rPr>
+                <w:rStyle w:val="Hipervnculo"/>
+                <w:noProof/>
+                <w:lang w:val="es-CO"/>
               </w:rPr>
               <w:t>4. Tecnología: ingeniería de datos y arquitectura</w:t>
             </w:r>
@@ -2166,7 +2223,7 @@
               <w:rPr>
                 <w:noProof/>
               </w:rPr>
-              <w:instrText xml:space="preserve"> PAGEREF _Toc231856424 \h </w:instrText>
+              <w:instrText xml:space="preserve"> PAGEREF _Toc231897064 \h </w:instrText>
             </w:r>
             <w:r>
               <w:rPr>
@@ -2195,6 +2252,7 @@
         </w:p>
         <w:p>
           <w:pPr>
+            <w:pStyle w:val="TDC2"/>
             <w:tabs>
               <w:tab w:val="right" w:leader="dot" w:pos="9350"/>
             </w:tabs>
@@ -2202,11 +2260,12 @@
               <w:noProof/>
             </w:rPr>
           </w:pPr>
-          <w:hyperlink w:anchor="_Toc231856425" w:history="1">
-            <w:r>
-              <w:rPr>
-                <w:rStyle w:val="Hyperlink"/>
-                <w:noProof/>
+          <w:hyperlink w:anchor="_Toc231897065" w:history="1">
+            <w:r>
+              <w:rPr>
+                <w:rStyle w:val="Hipervnculo"/>
+                <w:noProof/>
+                <w:lang w:val="es-CO"/>
               </w:rPr>
               <w:t>4.1 Desarrollo del proyecto (arquitectura implementada)</w:t>
             </w:r>
@@ -2226,7 +2285,7 @@
               <w:rPr>
                 <w:noProof/>
               </w:rPr>
-              <w:instrText xml:space="preserve"> PAGEREF _Toc231856425 \h </w:instrText>
+              <w:instrText xml:space="preserve"> PAGEREF _Toc231897065 \h </w:instrText>
             </w:r>
             <w:r>
               <w:rPr>
@@ -2255,6 +2314,7 @@
         </w:p>
         <w:p>
           <w:pPr>
+            <w:pStyle w:val="TDC2"/>
             <w:tabs>
               <w:tab w:val="right" w:leader="dot" w:pos="9350"/>
             </w:tabs>
@@ -2262,11 +2322,12 @@
               <w:noProof/>
             </w:rPr>
           </w:pPr>
-          <w:hyperlink w:anchor="_Toc231856426" w:history="1">
-            <w:r>
-              <w:rPr>
-                <w:rStyle w:val="Hyperlink"/>
-                <w:noProof/>
+          <w:hyperlink w:anchor="_Toc231897066" w:history="1">
+            <w:r>
+              <w:rPr>
+                <w:rStyle w:val="Hipervnculo"/>
+                <w:noProof/>
+                <w:lang w:val="es-CO"/>
               </w:rPr>
               <w:t>4.2 Despliegue (escenario hipotético de implementación real)</w:t>
             </w:r>
@@ -2286,7 +2347,7 @@
               <w:rPr>
                 <w:noProof/>
               </w:rPr>
-              <w:instrText xml:space="preserve"> PAGEREF _Toc231856426 \h </w:instrText>
+              <w:instrText xml:space="preserve"> PAGEREF _Toc231897066 \h </w:instrText>
             </w:r>
             <w:r>
               <w:rPr>
@@ -2303,7 +2364,7 @@
               <w:rPr>
                 <w:noProof/>
               </w:rPr>
-              <w:t>11</w:t>
+              <w:t>13</w:t>
             </w:r>
             <w:r>
               <w:rPr>
@@ -2315,6 +2376,7 @@
         </w:p>
         <w:p>
           <w:pPr>
+            <w:pStyle w:val="TDC1"/>
             <w:tabs>
               <w:tab w:val="right" w:leader="dot" w:pos="9350"/>
             </w:tabs>
@@ -2322,11 +2384,12 @@
               <w:noProof/>
             </w:rPr>
           </w:pPr>
-          <w:hyperlink w:anchor="_Toc231856427" w:history="1">
-            <w:r>
-              <w:rPr>
-                <w:rStyle w:val="Hyperlink"/>
-                <w:noProof/>
+          <w:hyperlink w:anchor="_Toc231897067" w:history="1">
+            <w:r>
+              <w:rPr>
+                <w:rStyle w:val="Hipervnculo"/>
+                <w:noProof/>
+                <w:lang w:val="es-CO"/>
               </w:rPr>
               <w:t>5. Visualización y comunicación de datos</w:t>
             </w:r>
@@ -2346,7 +2409,7 @@
               <w:rPr>
                 <w:noProof/>
               </w:rPr>
-              <w:instrText xml:space="preserve"> PAGEREF _Toc231856427 \h </w:instrText>
+              <w:instrText xml:space="preserve"> PAGEREF _Toc231897067 \h </w:instrText>
             </w:r>
             <w:r>
               <w:rPr>
@@ -2363,7 +2426,7 @@
               <w:rPr>
                 <w:noProof/>
               </w:rPr>
-              <w:t>12</w:t>
+              <w:t>13</w:t>
             </w:r>
             <w:r>
               <w:rPr>
@@ -2375,6 +2438,7 @@
         </w:p>
         <w:p>
           <w:pPr>
+            <w:pStyle w:val="TDC2"/>
             <w:tabs>
               <w:tab w:val="right" w:leader="dot" w:pos="9350"/>
             </w:tabs>
@@ -2382,11 +2446,12 @@
               <w:noProof/>
             </w:rPr>
           </w:pPr>
-          <w:hyperlink w:anchor="_Toc231856428" w:history="1">
-            <w:r>
-              <w:rPr>
-                <w:rStyle w:val="Hyperlink"/>
-                <w:noProof/>
+          <w:hyperlink w:anchor="_Toc231897068" w:history="1">
+            <w:r>
+              <w:rPr>
+                <w:rStyle w:val="Hipervnculo"/>
+                <w:noProof/>
+                <w:lang w:val="es-CO"/>
               </w:rPr>
               <w:t>5.1 Requerimientos de comunicación</w:t>
             </w:r>
@@ -2406,7 +2471,7 @@
               <w:rPr>
                 <w:noProof/>
               </w:rPr>
-              <w:instrText xml:space="preserve"> PAGEREF _Toc231856428 \h </w:instrText>
+              <w:instrText xml:space="preserve"> PAGEREF _Toc231897068 \h </w:instrText>
             </w:r>
             <w:r>
               <w:rPr>
@@ -2423,7 +2488,7 @@
               <w:rPr>
                 <w:noProof/>
               </w:rPr>
-              <w:t>12</w:t>
+              <w:t>13</w:t>
             </w:r>
             <w:r>
               <w:rPr>
@@ -2435,6 +2500,7 @@
         </w:p>
         <w:p>
           <w:pPr>
+            <w:pStyle w:val="TDC2"/>
             <w:tabs>
               <w:tab w:val="right" w:leader="dot" w:pos="9350"/>
             </w:tabs>
@@ -2442,10 +2508,10 @@
               <w:noProof/>
             </w:rPr>
           </w:pPr>
-          <w:hyperlink w:anchor="_Toc231856429" w:history="1">
-            <w:r>
-              <w:rPr>
-                <w:rStyle w:val="Hyperlink"/>
+          <w:hyperlink w:anchor="_Toc231897069" w:history="1">
+            <w:r>
+              <w:rPr>
+                <w:rStyle w:val="Hipervnculo"/>
                 <w:noProof/>
               </w:rPr>
               <w:t>5.2 Análisis (mapa pregunta → gráfico)</w:t>
@@ -2466,7 +2532,7 @@
               <w:rPr>
                 <w:noProof/>
               </w:rPr>
-              <w:instrText xml:space="preserve"> PAGEREF _Toc231856429 \h </w:instrText>
+              <w:instrText xml:space="preserve"> PAGEREF _Toc231897069 \h </w:instrText>
             </w:r>
             <w:r>
               <w:rPr>
@@ -2483,7 +2549,7 @@
               <w:rPr>
                 <w:noProof/>
               </w:rPr>
-              <w:t>12</w:t>
+              <w:t>13</w:t>
             </w:r>
             <w:r>
               <w:rPr>
@@ -2495,6 +2561,7 @@
         </w:p>
         <w:p>
           <w:pPr>
+            <w:pStyle w:val="TDC2"/>
             <w:tabs>
               <w:tab w:val="right" w:leader="dot" w:pos="9350"/>
             </w:tabs>
@@ -2502,11 +2569,12 @@
               <w:noProof/>
             </w:rPr>
           </w:pPr>
-          <w:hyperlink w:anchor="_Toc231856430" w:history="1">
-            <w:r>
-              <w:rPr>
-                <w:rStyle w:val="Hyperlink"/>
-                <w:noProof/>
+          <w:hyperlink w:anchor="_Toc231897070" w:history="1">
+            <w:r>
+              <w:rPr>
+                <w:rStyle w:val="Hipervnculo"/>
+                <w:noProof/>
+                <w:lang w:val="es-CO"/>
               </w:rPr>
               <w:t>5.3 Diseño</w:t>
             </w:r>
@@ -2526,7 +2594,7 @@
               <w:rPr>
                 <w:noProof/>
               </w:rPr>
-              <w:instrText xml:space="preserve"> PAGEREF _Toc231856430 \h </w:instrText>
+              <w:instrText xml:space="preserve"> PAGEREF _Toc231897070 \h </w:instrText>
             </w:r>
             <w:r>
               <w:rPr>
@@ -2543,7 +2611,7 @@
               <w:rPr>
                 <w:noProof/>
               </w:rPr>
-              <w:t>12</w:t>
+              <w:t>13</w:t>
             </w:r>
             <w:r>
               <w:rPr>
@@ -2555,6 +2623,7 @@
         </w:p>
         <w:p>
           <w:pPr>
+            <w:pStyle w:val="TDC2"/>
             <w:tabs>
               <w:tab w:val="right" w:leader="dot" w:pos="9350"/>
             </w:tabs>
@@ -2562,10 +2631,10 @@
               <w:noProof/>
             </w:rPr>
           </w:pPr>
-          <w:hyperlink w:anchor="_Toc231856431" w:history="1">
-            <w:r>
-              <w:rPr>
-                <w:rStyle w:val="Hyperlink"/>
+          <w:hyperlink w:anchor="_Toc231897071" w:history="1">
+            <w:r>
+              <w:rPr>
+                <w:rStyle w:val="Hipervnculo"/>
                 <w:noProof/>
               </w:rPr>
               <w:t>5.4 Implementación</w:t>
@@ -2586,7 +2655,7 @@
               <w:rPr>
                 <w:noProof/>
               </w:rPr>
-              <w:instrText xml:space="preserve"> PAGEREF _Toc231856431 \h </w:instrText>
+              <w:instrText xml:space="preserve"> PAGEREF _Toc231897071 \h </w:instrText>
             </w:r>
             <w:r>
               <w:rPr>
@@ -2603,7 +2672,7 @@
               <w:rPr>
                 <w:noProof/>
               </w:rPr>
-              <w:t>12</w:t>
+              <w:t>14</w:t>
             </w:r>
             <w:r>
               <w:rPr>
@@ -2615,6 +2684,7 @@
         </w:p>
         <w:p>
           <w:pPr>
+            <w:pStyle w:val="TDC2"/>
             <w:tabs>
               <w:tab w:val="right" w:leader="dot" w:pos="9350"/>
             </w:tabs>
@@ -2622,11 +2692,12 @@
               <w:noProof/>
             </w:rPr>
           </w:pPr>
-          <w:hyperlink w:anchor="_Toc231856432" w:history="1">
-            <w:r>
-              <w:rPr>
-                <w:rStyle w:val="Hyperlink"/>
-                <w:noProof/>
+          <w:hyperlink w:anchor="_Toc231897072" w:history="1">
+            <w:r>
+              <w:rPr>
+                <w:rStyle w:val="Hipervnculo"/>
+                <w:noProof/>
+                <w:lang w:val="es-CO"/>
               </w:rPr>
               <w:t>5.5 Validación</w:t>
             </w:r>
@@ -2646,7 +2717,7 @@
               <w:rPr>
                 <w:noProof/>
               </w:rPr>
-              <w:instrText xml:space="preserve"> PAGEREF _Toc231856432 \h </w:instrText>
+              <w:instrText xml:space="preserve"> PAGEREF _Toc231897072 \h </w:instrText>
             </w:r>
             <w:r>
               <w:rPr>
@@ -2663,7 +2734,7 @@
               <w:rPr>
                 <w:noProof/>
               </w:rPr>
-              <w:t>12</w:t>
+              <w:t>14</w:t>
             </w:r>
             <w:r>
               <w:rPr>
@@ -2675,6 +2746,7 @@
         </w:p>
         <w:p>
           <w:pPr>
+            <w:pStyle w:val="TDC1"/>
             <w:tabs>
               <w:tab w:val="right" w:leader="dot" w:pos="9350"/>
             </w:tabs>
@@ -2682,11 +2754,12 @@
               <w:noProof/>
             </w:rPr>
           </w:pPr>
-          <w:hyperlink w:anchor="_Toc231856433" w:history="1">
-            <w:r>
-              <w:rPr>
-                <w:rStyle w:val="Hyperlink"/>
-                <w:noProof/>
+          <w:hyperlink w:anchor="_Toc231897073" w:history="1">
+            <w:r>
+              <w:rPr>
+                <w:rStyle w:val="Hipervnculo"/>
+                <w:noProof/>
+                <w:lang w:val="es-CO"/>
               </w:rPr>
               <w:t>6. Conclusiones generales del proyecto</w:t>
             </w:r>
@@ -2706,7 +2779,7 @@
               <w:rPr>
                 <w:noProof/>
               </w:rPr>
-              <w:instrText xml:space="preserve"> PAGEREF _Toc231856433 \h </w:instrText>
+              <w:instrText xml:space="preserve"> PAGEREF _Toc231897073 \h </w:instrText>
             </w:r>
             <w:r>
               <w:rPr>
@@ -2723,7 +2796,7 @@
               <w:rPr>
                 <w:noProof/>
               </w:rPr>
-              <w:t>13</w:t>
+              <w:t>14</w:t>
             </w:r>
             <w:r>
               <w:rPr>
@@ -2735,6 +2808,7 @@
         </w:p>
         <w:p>
           <w:pPr>
+            <w:pStyle w:val="TDC1"/>
             <w:tabs>
               <w:tab w:val="right" w:leader="dot" w:pos="9350"/>
             </w:tabs>
@@ -2742,10 +2816,10 @@
               <w:noProof/>
             </w:rPr>
           </w:pPr>
-          <w:hyperlink w:anchor="_Toc231856434" w:history="1">
-            <w:r>
-              <w:rPr>
-                <w:rStyle w:val="Hyperlink"/>
+          <w:hyperlink w:anchor="_Toc231897074" w:history="1">
+            <w:r>
+              <w:rPr>
+                <w:rStyle w:val="Hipervnculo"/>
                 <w:noProof/>
               </w:rPr>
               <w:t>7. Referencias</w:t>
@@ -2766,7 +2840,7 @@
               <w:rPr>
                 <w:noProof/>
               </w:rPr>
-              <w:instrText xml:space="preserve"> PAGEREF _Toc231856434 \h </w:instrText>
+              <w:instrText xml:space="preserve"> PAGEREF _Toc231897074 \h </w:instrText>
             </w:r>
             <w:r>
               <w:rPr>
@@ -2783,7 +2857,7 @@
               <w:rPr>
                 <w:noProof/>
               </w:rPr>
-              <w:t>13</w:t>
+              <w:t>15</w:t>
             </w:r>
             <w:r>
               <w:rPr>
@@ -2812,11 +2886,12 @@
           <w:lang w:val="es-CO"/>
         </w:rPr>
       </w:pPr>
-      <w:bookmarkStart w:id="1" w:name="_Toc231856395"/>
-      <w:r>
-        <w:rPr>
-          <w:lang w:val="es-CO"/>
-        </w:rPr>
+      <w:bookmarkStart w:id="1" w:name="_Toc231897035"/>
+      <w:r>
+        <w:rPr>
+          <w:lang w:val="es-CO"/>
+        </w:rPr>
+        <w:lastRenderedPageBreak/>
         <w:t>1. Introducción</w:t>
       </w:r>
       <w:bookmarkEnd w:id="1"/>
@@ -2949,7 +3024,7 @@
       <w:commentRangeEnd w:id="2"/>
       <w:r>
         <w:rPr>
-          <w:rStyle w:val="CommentReference"/>
+          <w:rStyle w:val="Refdecomentario"/>
           <w:sz w:val="22"/>
           <w:szCs w:val="22"/>
           <w:lang w:val="es-CO"/>
@@ -2992,7 +3067,7 @@
           <w:lang w:val="es-CO"/>
         </w:rPr>
       </w:pPr>
-      <w:bookmarkStart w:id="4" w:name="_Toc231856396"/>
+      <w:bookmarkStart w:id="4" w:name="_Toc231897036"/>
       <w:r>
         <w:rPr>
           <w:lang w:val="es-CO"/>
@@ -3036,7 +3111,7 @@
           <w:lang w:val="es-CO"/>
         </w:rPr>
       </w:pPr>
-      <w:bookmarkStart w:id="5" w:name="_Toc231856397"/>
+      <w:bookmarkStart w:id="5" w:name="_Toc231897037"/>
       <w:r>
         <w:rPr>
           <w:lang w:val="es-CO"/>
@@ -3070,7 +3145,14 @@
         <w:rPr>
           <w:lang w:val="es-CO"/>
         </w:rPr>
-        <w:t xml:space="preserve"> (average precision), que pone la clase positiva rara en primer plano, junto con precision/recall en el punto de operación; el ROC-AUC puede verse optimista con positivos raros. El desbalance se trata dentro del entrenamiento (class_weight / scale_pos_weight, o remuestreo) y nunca sobre el conjunto de prueba. Además, discriminar ≠ calibrar: una probabilidad bien ordenada puede estar mal calibrada, por lo que se reporta la curva de calibración y el Brier score. Finalmente, el umbral es una política operativa, no 0.5: se define por el costo del error y la capacidad de intervención.</w:t>
+        <w:t xml:space="preserve"> (average precision), que pone la clase positiva rara en primer plano, junto con precision/recall en el punto de operación; el ROC-AUC puede verse optimista con positivos raros. El desbalance se trata dentro del entrenamiento (class_weight / </w:t>
+      </w:r>
+      <w:r>
+        <w:rPr>
+          <w:lang w:val="es-CO"/>
+        </w:rPr>
+        <w:lastRenderedPageBreak/>
+        <w:t>scale_pos_weight, o remuestreo) y nunca sobre el conjunto de prueba. Además, discriminar ≠ calibrar: una probabilidad bien ordenada puede estar mal calibrada, por lo que se reporta la curva de calibración y el Brier score. Finalmente, el umbral es una política operativa, no 0.5: se define por el costo del error y la capacidad de intervención.</w:t>
       </w:r>
     </w:p>
     <w:p>
@@ -3080,7 +3162,7 @@
           <w:lang w:val="es-CO"/>
         </w:rPr>
       </w:pPr>
-      <w:bookmarkStart w:id="6" w:name="_Toc231856398"/>
+      <w:bookmarkStart w:id="6" w:name="_Toc231897038"/>
       <w:r>
         <w:rPr>
           <w:lang w:val="es-CO"/>
@@ -3111,7 +3193,7 @@
           <w:lang w:val="es-CO"/>
         </w:rPr>
       </w:pPr>
-      <w:bookmarkStart w:id="7" w:name="_Toc231856399"/>
+      <w:bookmarkStart w:id="7" w:name="_Toc231897039"/>
       <w:r>
         <w:rPr>
           <w:lang w:val="es-CO"/>
@@ -3151,7 +3233,7 @@
           <w:lang w:val="es-CO"/>
         </w:rPr>
       </w:pPr>
-      <w:bookmarkStart w:id="8" w:name="_Toc231856400"/>
+      <w:bookmarkStart w:id="8" w:name="_Toc231897040"/>
       <w:r>
         <w:rPr>
           <w:lang w:val="es-CO"/>
@@ -3195,7 +3277,7 @@
           <w:lang w:val="es-CO"/>
         </w:rPr>
       </w:pPr>
-      <w:bookmarkStart w:id="9" w:name="_Toc231856401"/>
+      <w:bookmarkStart w:id="9" w:name="_Toc231897041"/>
       <w:r>
         <w:rPr>
           <w:lang w:val="es-CO"/>
@@ -3226,7 +3308,7 @@
           <w:lang w:val="es-CO"/>
         </w:rPr>
       </w:pPr>
-      <w:bookmarkStart w:id="10" w:name="_Toc231856402"/>
+      <w:bookmarkStart w:id="10" w:name="_Toc231897042"/>
       <w:r>
         <w:rPr>
           <w:lang w:val="es-CO"/>
@@ -3238,22 +3320,11 @@
     <w:p>
       <w:pPr>
         <w:rPr>
-          <w:b w:val="0"/>
-          <w:bCs w:val="0"/>
-          <w:color w:val="auto"/>
-          <w:sz w:val="22"/>
-          <w:szCs w:val="22"/>
-          <w:lang w:val="es-CO"/>
-        </w:rPr>
-      </w:pPr>
-      <w:bookmarkStart w:id="11" w:name="_Toc231856403"/>
-      <w:r>
-        <w:rPr>
-          <w:b w:val="0"/>
-          <w:bCs w:val="0"/>
-          <w:color w:val="auto"/>
-          <w:sz w:val="22"/>
-          <w:szCs w:val="22"/>
+          <w:lang w:val="es-CO"/>
+        </w:rPr>
+      </w:pPr>
+      <w:r>
+        <w:rPr>
           <w:lang w:val="es-CO"/>
         </w:rPr>
         <w:t>La evolución de las arquitecturas de datos exige seleccionar las herramientas según el volumen, la latencia y la gobernanza requerida. El proyecto adopta una arquitectura Lakehouse unificando la flexibilidad de un lago de datos con las transacciones ACID y el schema enforcement propios de un Data Warehouse, implementado mediante el formato Delta Lake.</w:t>
@@ -3262,35 +3333,21 @@
     <w:p>
       <w:pPr>
         <w:rPr>
-          <w:b w:val="0"/>
-          <w:bCs w:val="0"/>
-          <w:color w:val="auto"/>
-          <w:sz w:val="22"/>
-          <w:szCs w:val="22"/>
-          <w:lang w:val="es-CO"/>
-        </w:rPr>
-      </w:pPr>
-    </w:p>
-    <w:p>
-      <w:pPr>
-        <w:rPr>
-          <w:b w:val="0"/>
-          <w:bCs w:val="0"/>
-          <w:color w:val="auto"/>
-          <w:sz w:val="22"/>
-          <w:szCs w:val="22"/>
-          <w:lang w:val="es-CO"/>
-        </w:rPr>
-      </w:pPr>
-      <w:r>
-        <w:rPr>
-          <w:b w:val="0"/>
-          <w:bCs w:val="0"/>
-          <w:color w:val="auto"/>
-          <w:sz w:val="22"/>
-          <w:szCs w:val="22"/>
-          <w:lang w:val="es-CO"/>
-        </w:rPr>
+          <w:lang w:val="es-CO"/>
+        </w:rPr>
+      </w:pPr>
+    </w:p>
+    <w:p>
+      <w:pPr>
+        <w:rPr>
+          <w:lang w:val="es-CO"/>
+        </w:rPr>
+      </w:pPr>
+      <w:r>
+        <w:rPr>
+          <w:lang w:val="es-CO"/>
+        </w:rPr>
+        <w:lastRenderedPageBreak/>
         <w:t>Para el procesamiento, en lugar de utilizar una arquitectura Lambda (que exige mantener y sincronizar vías batch y streaming paralelas y complejas), el diseño implementado adopta un estilo Kappa. Al carecer de un bus de eventos en vivo, los archivos estáticos históricos se tratan como un log de eventos inmutable. Esto permite utilizar una única tubería de streaming para procesar los datos de forma reproducible, simulando un entorno de producción real.</w:t>
       </w:r>
     </w:p>
@@ -3301,6 +3358,7 @@
           <w:lang w:val="es-CO"/>
         </w:rPr>
       </w:pPr>
+      <w:bookmarkStart w:id="11" w:name="_Toc231897043"/>
       <w:r>
         <w:rPr>
           <w:lang w:val="es-CO"/>
@@ -3331,7 +3389,7 @@
           <w:lang w:val="es-CO"/>
         </w:rPr>
       </w:pPr>
-      <w:bookmarkStart w:id="12" w:name="_Toc231856404"/>
+      <w:bookmarkStart w:id="12" w:name="_Toc231897044"/>
       <w:r>
         <w:rPr>
           <w:lang w:val="es-CO"/>
@@ -3347,7 +3405,7 @@
           <w:lang w:val="es-CO"/>
         </w:rPr>
       </w:pPr>
-      <w:bookmarkStart w:id="13" w:name="_Toc231856405"/>
+      <w:bookmarkStart w:id="13" w:name="_Toc231897045"/>
       <w:r>
         <w:rPr>
           <w:lang w:val="es-CO"/>
@@ -3358,7 +3416,7 @@
     </w:p>
     <w:p>
       <w:pPr>
-        <w:pStyle w:val="ListParagraph"/>
+        <w:pStyle w:val="Prrafodelista"/>
         <w:numPr>
           <w:ilvl w:val="0"/>
           <w:numId w:val="2"/>
@@ -3377,7 +3435,7 @@
     </w:p>
     <w:p>
       <w:pPr>
-        <w:pStyle w:val="ListParagraph"/>
+        <w:pStyle w:val="Prrafodelista"/>
         <w:numPr>
           <w:ilvl w:val="0"/>
           <w:numId w:val="2"/>
@@ -3396,7 +3454,7 @@
     </w:p>
     <w:p>
       <w:pPr>
-        <w:pStyle w:val="ListParagraph"/>
+        <w:pStyle w:val="Prrafodelista"/>
         <w:numPr>
           <w:ilvl w:val="0"/>
           <w:numId w:val="2"/>
@@ -3420,7 +3478,7 @@
           <w:lang w:val="es-CO"/>
         </w:rPr>
       </w:pPr>
-      <w:bookmarkStart w:id="14" w:name="_Toc231856406"/>
+      <w:bookmarkStart w:id="14" w:name="_Toc231897046"/>
       <w:r>
         <w:rPr>
           <w:lang w:val="es-CO"/>
@@ -3451,7 +3509,7 @@
           <w:lang w:val="es-CO"/>
         </w:rPr>
       </w:pPr>
-      <w:bookmarkStart w:id="15" w:name="_Toc231856407"/>
+      <w:bookmarkStart w:id="15" w:name="_Toc231897047"/>
       <w:r>
         <w:rPr>
           <w:lang w:val="es-CO"/>
@@ -3506,7 +3564,7 @@
           <w:lang w:val="es-CO"/>
         </w:rPr>
       </w:pPr>
-      <w:bookmarkStart w:id="16" w:name="_Toc231856408"/>
+      <w:bookmarkStart w:id="16" w:name="_Toc231897048"/>
       <w:r>
         <w:rPr>
           <w:lang w:val="es-CO"/>
@@ -3532,7 +3590,7 @@
     </w:p>
     <w:p>
       <w:pPr>
-        <w:pStyle w:val="ListParagraph"/>
+        <w:pStyle w:val="Prrafodelista"/>
         <w:numPr>
           <w:ilvl w:val="0"/>
           <w:numId w:val="2"/>
@@ -3550,7 +3608,14 @@
         <w:rPr>
           <w:lang w:val="es-CO"/>
         </w:rPr>
-        <w:t xml:space="preserve">Ventana corrupta con criterio doble (etiqueta rota o volumen anómalo): el 15-nov registra 0 compras pese a ~467 k carritos, y el 14-nov presenta un volcado de eventos por encima del propio Black Friday con conversión a la mitad. Se marcan con label_window_corrupt y se excluyen de entrenamiento y de evaluación. </w:t>
+        <w:t xml:space="preserve">Ventana corrupta con criterio doble (etiqueta rota o volumen anómalo): el 15-nov registra 0 compras pese a ~467 k carritos, </w:t>
+      </w:r>
+      <w:r>
+        <w:rPr>
+          <w:lang w:val="es-CO"/>
+        </w:rPr>
+        <w:lastRenderedPageBreak/>
+        <w:t xml:space="preserve">y el 14-nov presenta un volcado de eventos por encima del propio Black Friday con conversión a la mitad. Se marcan con label_window_corrupt y se excluyen de entrenamiento y de evaluación. </w:t>
       </w:r>
       <w:r>
         <w:t>El 13-nov no se cuarentena.</w:t>
@@ -3558,7 +3623,7 @@
     </w:p>
     <w:p>
       <w:pPr>
-        <w:pStyle w:val="ListParagraph"/>
+        <w:pStyle w:val="Prrafodelista"/>
         <w:numPr>
           <w:ilvl w:val="0"/>
           <w:numId w:val="2"/>
@@ -3584,7 +3649,7 @@
     </w:p>
     <w:p>
       <w:pPr>
-        <w:pStyle w:val="ListParagraph"/>
+        <w:pStyle w:val="Prrafodelista"/>
         <w:numPr>
           <w:ilvl w:val="0"/>
           <w:numId w:val="2"/>
@@ -3610,7 +3675,7 @@
     </w:p>
     <w:p>
       <w:pPr>
-        <w:pStyle w:val="ListParagraph"/>
+        <w:pStyle w:val="Prrafodelista"/>
         <w:numPr>
           <w:ilvl w:val="0"/>
           <w:numId w:val="2"/>
@@ -3641,7 +3706,7 @@
           <w:lang w:val="es-CO"/>
         </w:rPr>
       </w:pPr>
-      <w:bookmarkStart w:id="17" w:name="_Toc231856409"/>
+      <w:bookmarkStart w:id="17" w:name="_Toc231897049"/>
       <w:r>
         <w:rPr>
           <w:lang w:val="es-CO"/>
@@ -3704,7 +3769,7 @@
     </w:p>
     <w:p>
       <w:pPr>
-        <w:pStyle w:val="ListParagraph"/>
+        <w:pStyle w:val="Prrafodelista"/>
         <w:numPr>
           <w:ilvl w:val="0"/>
           <w:numId w:val="2"/>
@@ -3730,7 +3795,7 @@
     </w:p>
     <w:p>
       <w:pPr>
-        <w:pStyle w:val="ListParagraph"/>
+        <w:pStyle w:val="Prrafodelista"/>
         <w:numPr>
           <w:ilvl w:val="0"/>
           <w:numId w:val="2"/>
@@ -3783,7 +3848,7 @@
           <w:lang w:val="es-CO"/>
         </w:rPr>
       </w:pPr>
-      <w:bookmarkStart w:id="18" w:name="_Toc231856410"/>
+      <w:bookmarkStart w:id="18" w:name="_Toc231897050"/>
       <w:r>
         <w:rPr>
           <w:lang w:val="es-CO"/>
@@ -3799,7 +3864,7 @@
           <w:lang w:val="es-CO"/>
         </w:rPr>
       </w:pPr>
-      <w:bookmarkStart w:id="19" w:name="_Toc231856411"/>
+      <w:bookmarkStart w:id="19" w:name="_Toc231897051"/>
       <w:r>
         <w:rPr>
           <w:lang w:val="es-CO"/>
@@ -3830,7 +3895,7 @@
           <w:lang w:val="es-CO"/>
         </w:rPr>
       </w:pPr>
-      <w:bookmarkStart w:id="20" w:name="_Toc231856412"/>
+      <w:bookmarkStart w:id="20" w:name="_Toc231897052"/>
       <w:r>
         <w:rPr>
           <w:lang w:val="es-CO"/>
@@ -3850,13 +3915,8 @@
         <w:rPr>
           <w:lang w:val="es-CO"/>
         </w:rPr>
-        <w:t>Se sigue una secuencia deliberada de lo simple a lo sofisticado, donde cada</w:t>
-      </w:r>
-      <w:r>
-        <w:rPr>
-          <w:lang w:val="es-CO"/>
-        </w:rPr>
-        <w:t xml:space="preserve"> paso debe superar al anterior:</w:t>
+        <w:lastRenderedPageBreak/>
+        <w:t>Se sigue una secuencia deliberada de lo simple a lo sofisticado, donde cada paso debe superar al anterior:</w:t>
       </w:r>
     </w:p>
     <w:tbl>
@@ -4432,7 +4492,7 @@
       <w:pPr>
         <w:pStyle w:val="heading30"/>
       </w:pPr>
-      <w:bookmarkStart w:id="21" w:name="_Toc231856413"/>
+      <w:bookmarkStart w:id="21" w:name="_Toc231897053"/>
       <w:r>
         <w:t>3.3.3 Entrenamiento</w:t>
       </w:r>
@@ -4440,7 +4500,7 @@
     </w:p>
     <w:p>
       <w:pPr>
-        <w:pStyle w:val="ListParagraph"/>
+        <w:pStyle w:val="Prrafodelista"/>
         <w:numPr>
           <w:ilvl w:val="0"/>
           <w:numId w:val="2"/>
@@ -4468,7 +4528,7 @@
     </w:p>
     <w:p>
       <w:pPr>
-        <w:pStyle w:val="ListParagraph"/>
+        <w:pStyle w:val="Prrafodelista"/>
         <w:numPr>
           <w:ilvl w:val="0"/>
           <w:numId w:val="2"/>
@@ -4494,7 +4554,7 @@
     </w:p>
     <w:p>
       <w:pPr>
-        <w:pStyle w:val="ListParagraph"/>
+        <w:pStyle w:val="Prrafodelista"/>
         <w:numPr>
           <w:ilvl w:val="0"/>
           <w:numId w:val="2"/>
@@ -4513,7 +4573,7 @@
     </w:p>
     <w:p>
       <w:pPr>
-        <w:pStyle w:val="ListParagraph"/>
+        <w:pStyle w:val="Prrafodelista"/>
         <w:numPr>
           <w:ilvl w:val="0"/>
           <w:numId w:val="2"/>
@@ -4526,13 +4586,12 @@
         </w:rPr>
         <w:t>HPO con Optuna (TPE bayesiano) optimizando PR-AUC en 5-fold CV. El tuneo llevó el PR-AUC de 0.118 (sin tunear) a 0.124 (0.1235 ± 0.0014 en CV de 5 folds: baja variabilidad entre folds, no un máximo aislado). Calibración final con CalibratedClassifierCV.</w:t>
       </w:r>
-      <w:r/>
     </w:p>
     <w:p>
       <w:pPr>
         <w:pStyle w:val="heading30"/>
       </w:pPr>
-      <w:bookmarkStart w:id="22" w:name="_Toc231856414"/>
+      <w:bookmarkStart w:id="22" w:name="_Toc231897054"/>
       <w:r>
         <w:t>3.3.4 Evaluación</w:t>
       </w:r>
@@ -5056,6 +5115,7 @@
           <w:b/>
           <w:lang w:val="es-CO"/>
         </w:rPr>
+        <w:lastRenderedPageBreak/>
         <w:t xml:space="preserve">Top features por importancia de permutación: </w:t>
       </w:r>
       <w:r>
@@ -5625,13 +5685,7 @@
               <w:rPr>
                 <w:lang w:val="es-CO"/>
               </w:rPr>
-              <w:t>Navega much</w:t>
-            </w:r>
-            <w:r>
-              <w:rPr>
-                <w:lang w:val="es-CO"/>
-              </w:rPr>
-              <w:t>o (18.5 vistas) y compra poco</w:t>
+              <w:t>Navega mucho (18.5 vistas) y compra poco</w:t>
             </w:r>
           </w:p>
         </w:tc>
@@ -5768,7 +5822,7 @@
           <w:lang w:val="es-CO"/>
         </w:rPr>
       </w:pPr>
-      <w:bookmarkStart w:id="23" w:name="_Toc231856415"/>
+      <w:bookmarkStart w:id="23" w:name="_Toc231897055"/>
       <w:r>
         <w:rPr>
           <w:lang w:val="es-CO"/>
@@ -5779,7 +5833,7 @@
     </w:p>
     <w:p>
       <w:pPr>
-        <w:pStyle w:val="ListParagraph"/>
+        <w:pStyle w:val="Prrafodelista"/>
         <w:numPr>
           <w:ilvl w:val="0"/>
           <w:numId w:val="2"/>
@@ -5798,7 +5852,7 @@
     </w:p>
     <w:p>
       <w:pPr>
-        <w:pStyle w:val="ListParagraph"/>
+        <w:pStyle w:val="Prrafodelista"/>
         <w:numPr>
           <w:ilvl w:val="0"/>
           <w:numId w:val="2"/>
@@ -5817,7 +5871,7 @@
     </w:p>
     <w:p>
       <w:pPr>
-        <w:pStyle w:val="ListParagraph"/>
+        <w:pStyle w:val="Prrafodelista"/>
         <w:numPr>
           <w:ilvl w:val="0"/>
           <w:numId w:val="2"/>
@@ -5836,7 +5890,7 @@
     </w:p>
     <w:p>
       <w:pPr>
-        <w:pStyle w:val="ListParagraph"/>
+        <w:pStyle w:val="Prrafodelista"/>
         <w:numPr>
           <w:ilvl w:val="0"/>
           <w:numId w:val="2"/>
@@ -5860,7 +5914,7 @@
           <w:lang w:val="es-CO"/>
         </w:rPr>
       </w:pPr>
-      <w:bookmarkStart w:id="24" w:name="_Toc231856416"/>
+      <w:bookmarkStart w:id="24" w:name="_Toc231897056"/>
       <w:r>
         <w:rPr>
           <w:lang w:val="es-CO"/>
@@ -5876,7 +5930,7 @@
           <w:lang w:val="es-CO"/>
         </w:rPr>
       </w:pPr>
-      <w:bookmarkStart w:id="25" w:name="_Toc231856417"/>
+      <w:bookmarkStart w:id="25" w:name="_Toc231897057"/>
       <w:r>
         <w:rPr>
           <w:lang w:val="es-CO"/>
@@ -5897,7 +5951,14 @@
         <w:rPr>
           <w:lang w:val="es-CO"/>
         </w:rPr>
-        <w:t>La propuesta original prometía un modelo de uplift, no estimable con estos datos: el uplift mide un efecto causal y requiere grupos tratado y control; el dataset es observacional. El proyecto no estima causalidad: entrega el diseño del experimento que generaría esos datos. El A/B es precisamente el mecanismo que produce los pares tratamiento/control sobre los que, en una segunda fase, sí podría entrenarse un modelo de uplift. El clasificador no reemplaza al experimento: selecciona a quién vale la pena exponer al incentivo; el experimento mide si el incentivo funciona.</w:t>
+        <w:t xml:space="preserve">La propuesta original prometía un modelo de uplift, no estimable con estos datos: el uplift mide un efecto causal y requiere grupos tratado y control; el dataset es observacional. El proyecto no estima causalidad: entrega el diseño del experimento que generaría esos datos. El A/B es precisamente el mecanismo que produce los pares tratamiento/control sobre los que, en una segunda fase, sí podría entrenarse un modelo de uplift. El clasificador no reemplaza al </w:t>
+      </w:r>
+      <w:r>
+        <w:rPr>
+          <w:lang w:val="es-CO"/>
+        </w:rPr>
+        <w:lastRenderedPageBreak/>
+        <w:t>experimento: selecciona a quién vale la pena exponer al incentivo; el experimento mide si el incentivo funciona.</w:t>
       </w:r>
     </w:p>
     <w:p>
@@ -5907,7 +5968,7 @@
           <w:lang w:val="es-CO"/>
         </w:rPr>
       </w:pPr>
-      <w:bookmarkStart w:id="26" w:name="_Toc231856418"/>
+      <w:bookmarkStart w:id="26" w:name="_Toc231897058"/>
       <w:r>
         <w:rPr>
           <w:lang w:val="es-CO"/>
@@ -5933,7 +5994,7 @@
     </w:p>
     <w:p>
       <w:pPr>
-        <w:pStyle w:val="ListParagraph"/>
+        <w:pStyle w:val="Prrafodelista"/>
         <w:numPr>
           <w:ilvl w:val="0"/>
           <w:numId w:val="2"/>
@@ -5952,7 +6013,7 @@
     </w:p>
     <w:p>
       <w:pPr>
-        <w:pStyle w:val="ListParagraph"/>
+        <w:pStyle w:val="Prrafodelista"/>
         <w:numPr>
           <w:ilvl w:val="0"/>
           <w:numId w:val="2"/>
@@ -5971,7 +6032,7 @@
     </w:p>
     <w:p>
       <w:pPr>
-        <w:pStyle w:val="ListParagraph"/>
+        <w:pStyle w:val="Prrafodelista"/>
         <w:numPr>
           <w:ilvl w:val="0"/>
           <w:numId w:val="2"/>
@@ -5995,7 +6056,7 @@
           <w:lang w:val="es-CO"/>
         </w:rPr>
       </w:pPr>
-      <w:bookmarkStart w:id="27" w:name="_Toc231856419"/>
+      <w:bookmarkStart w:id="27" w:name="_Toc231897059"/>
       <w:r>
         <w:rPr>
           <w:lang w:val="es-CO"/>
@@ -6023,7 +6084,7 @@
       <w:pPr>
         <w:pStyle w:val="heading30"/>
       </w:pPr>
-      <w:bookmarkStart w:id="28" w:name="_Toc231856420"/>
+      <w:bookmarkStart w:id="28" w:name="_Toc231897060"/>
       <w:r>
         <w:t>3.5.4 Unidad de aleatorización y asignación</w:t>
       </w:r>
@@ -6031,7 +6092,7 @@
     </w:p>
     <w:p>
       <w:pPr>
-        <w:pStyle w:val="ListParagraph"/>
+        <w:pStyle w:val="Prrafodelista"/>
         <w:numPr>
           <w:ilvl w:val="0"/>
           <w:numId w:val="2"/>
@@ -6050,7 +6111,7 @@
     </w:p>
     <w:p>
       <w:pPr>
-        <w:pStyle w:val="ListParagraph"/>
+        <w:pStyle w:val="Prrafodelista"/>
         <w:numPr>
           <w:ilvl w:val="0"/>
           <w:numId w:val="2"/>
@@ -6069,7 +6130,7 @@
     </w:p>
     <w:p>
       <w:pPr>
-        <w:pStyle w:val="ListParagraph"/>
+        <w:pStyle w:val="Prrafodelista"/>
         <w:numPr>
           <w:ilvl w:val="0"/>
           <w:numId w:val="2"/>
@@ -6090,7 +6151,7 @@
       <w:pPr>
         <w:pStyle w:val="heading30"/>
       </w:pPr>
-      <w:bookmarkStart w:id="29" w:name="_Toc231856421"/>
+      <w:bookmarkStart w:id="29" w:name="_Toc231897061"/>
       <w:r>
         <w:t>3.5.5 Métricas</w:t>
       </w:r>
@@ -6098,7 +6159,7 @@
     </w:p>
     <w:p>
       <w:pPr>
-        <w:pStyle w:val="ListParagraph"/>
+        <w:pStyle w:val="Prrafodelista"/>
         <w:numPr>
           <w:ilvl w:val="0"/>
           <w:numId w:val="2"/>
@@ -6117,7 +6178,7 @@
     </w:p>
     <w:p>
       <w:pPr>
-        <w:pStyle w:val="ListParagraph"/>
+        <w:pStyle w:val="Prrafodelista"/>
         <w:numPr>
           <w:ilvl w:val="0"/>
           <w:numId w:val="2"/>
@@ -6136,7 +6197,7 @@
     </w:p>
     <w:p>
       <w:pPr>
-        <w:pStyle w:val="ListParagraph"/>
+        <w:pStyle w:val="Prrafodelista"/>
         <w:numPr>
           <w:ilvl w:val="0"/>
           <w:numId w:val="2"/>
@@ -6160,7 +6221,7 @@
           <w:lang w:val="es-CO"/>
         </w:rPr>
       </w:pPr>
-      <w:bookmarkStart w:id="30" w:name="_Toc231856422"/>
+      <w:bookmarkStart w:id="30" w:name="_Toc231897062"/>
       <w:r>
         <w:rPr>
           <w:lang w:val="es-CO"/>
@@ -6216,12 +6277,6 @@
         <w:gridCol w:w="2180"/>
       </w:tblGrid>
       <w:tr>
-        <w:tblPrEx>
-          <w:tblCellMar>
-            <w:top w:w="0" w:type="dxa"/>
-            <w:bottom w:w="0" w:type="dxa"/>
-          </w:tblCellMar>
-        </w:tblPrEx>
         <w:trPr>
           <w:tblHeader/>
         </w:trPr>
@@ -6335,12 +6390,6 @@
         </w:tc>
       </w:tr>
       <w:tr>
-        <w:tblPrEx>
-          <w:tblCellMar>
-            <w:top w:w="0" w:type="dxa"/>
-            <w:bottom w:w="0" w:type="dxa"/>
-          </w:tblCellMar>
-        </w:tblPrEx>
         <w:tc>
           <w:tcPr>
             <w:tcW w:w="2600" w:type="dxa"/>
@@ -6438,12 +6487,6 @@
         </w:tc>
       </w:tr>
       <w:tr>
-        <w:tblPrEx>
-          <w:tblCellMar>
-            <w:top w:w="0" w:type="dxa"/>
-            <w:bottom w:w="0" w:type="dxa"/>
-          </w:tblCellMar>
-        </w:tblPrEx>
         <w:tc>
           <w:tcPr>
             <w:tcW w:w="2600" w:type="dxa"/>
@@ -6538,12 +6581,6 @@
         </w:tc>
       </w:tr>
       <w:tr>
-        <w:tblPrEx>
-          <w:tblCellMar>
-            <w:top w:w="0" w:type="dxa"/>
-            <w:bottom w:w="0" w:type="dxa"/>
-          </w:tblCellMar>
-        </w:tblPrEx>
         <w:tc>
           <w:tcPr>
             <w:tcW w:w="2600" w:type="dxa"/>
@@ -6651,6 +6688,7 @@
           <w:b/>
           <w:lang w:val="es-CO"/>
         </w:rPr>
+        <w:lastRenderedPageBreak/>
         <w:t xml:space="preserve">Duración. </w:t>
       </w:r>
       <w:r>
@@ -6667,7 +6705,7 @@
           <w:lang w:val="es-CO"/>
         </w:rPr>
       </w:pPr>
-      <w:bookmarkStart w:id="31" w:name="_Toc231856423"/>
+      <w:bookmarkStart w:id="31" w:name="_Toc231897063"/>
       <w:r>
         <w:rPr>
           <w:lang w:val="es-CO"/>
@@ -6698,7 +6736,7 @@
           <w:lang w:val="es-CO"/>
         </w:rPr>
       </w:pPr>
-      <w:bookmarkStart w:id="32" w:name="_Toc231856424"/>
+      <w:bookmarkStart w:id="32" w:name="_Toc231897064"/>
       <w:r>
         <w:rPr>
           <w:lang w:val="es-CO"/>
@@ -6729,7 +6767,7 @@
           <w:lang w:val="es-CO"/>
         </w:rPr>
       </w:pPr>
-      <w:bookmarkStart w:id="33" w:name="_Toc231856425"/>
+      <w:bookmarkStart w:id="33" w:name="_Toc231897065"/>
       <w:r>
         <w:rPr>
           <w:lang w:val="es-CO"/>
@@ -6740,7 +6778,7 @@
     </w:p>
     <w:p>
       <w:pPr>
-        <w:pStyle w:val="ListParagraph"/>
+        <w:pStyle w:val="Prrafodelista"/>
         <w:numPr>
           <w:ilvl w:val="0"/>
           <w:numId w:val="2"/>
@@ -6766,7 +6804,7 @@
     </w:p>
     <w:p>
       <w:pPr>
-        <w:pStyle w:val="ListParagraph"/>
+        <w:pStyle w:val="Prrafodelista"/>
         <w:numPr>
           <w:ilvl w:val="0"/>
           <w:numId w:val="2"/>
@@ -6834,7 +6872,7 @@
     </w:p>
     <w:p>
       <w:pPr>
-        <w:pStyle w:val="ListParagraph"/>
+        <w:pStyle w:val="Prrafodelista"/>
         <w:numPr>
           <w:ilvl w:val="0"/>
           <w:numId w:val="2"/>
@@ -6860,7 +6898,7 @@
     </w:p>
     <w:p>
       <w:pPr>
-        <w:pStyle w:val="ListParagraph"/>
+        <w:pStyle w:val="Prrafodelista"/>
         <w:numPr>
           <w:ilvl w:val="0"/>
           <w:numId w:val="2"/>
@@ -6893,7 +6931,7 @@
     </w:p>
     <w:p>
       <w:pPr>
-        <w:pStyle w:val="ListParagraph"/>
+        <w:pStyle w:val="Prrafodelista"/>
         <w:spacing w:after="80"/>
         <w:ind w:left="720"/>
         <w:rPr>
@@ -6917,7 +6955,7 @@
     </w:p>
     <w:p>
       <w:pPr>
-        <w:pStyle w:val="ListParagraph"/>
+        <w:pStyle w:val="Prrafodelista"/>
         <w:spacing w:after="80"/>
         <w:ind w:left="720"/>
         <w:rPr>
@@ -6927,7 +6965,7 @@
     </w:p>
     <w:p>
       <w:pPr>
-        <w:pStyle w:val="ListParagraph"/>
+        <w:pStyle w:val="Prrafodelista"/>
         <w:numPr>
           <w:ilvl w:val="0"/>
           <w:numId w:val="2"/>
@@ -6942,6 +6980,7 @@
           <w:b/>
           <w:lang w:val="es-CO"/>
         </w:rPr>
+        <w:lastRenderedPageBreak/>
         <w:t xml:space="preserve">Framework de procesamiento. </w:t>
       </w:r>
       <w:r>
@@ -6953,7 +6992,7 @@
     </w:p>
     <w:p>
       <w:pPr>
-        <w:pStyle w:val="ListParagraph"/>
+        <w:pStyle w:val="Prrafodelista"/>
         <w:numPr>
           <w:ilvl w:val="0"/>
           <w:numId w:val="2"/>
@@ -6974,7 +7013,7 @@
         <w:rPr>
           <w:lang w:val="es-CO"/>
         </w:rPr>
-        <w:t xml:space="preserve">El modelo de propensión se entrenó y calibró íntegramente en el entorno local (Python, scikit-learn, LightGBM) donde los 16.97 M de filas de entrenamiento caben con margen en la memoria del proceso. El artefacto resultante (CalibratedClassifierCV sobre LightGBM, serializado con joblib) se subió al Volume de Databricks para su uso en el pipeline de producción.</w:t>
+        <w:t>El modelo de propensión se entrenó y calibró íntegramente en el entorno local (Python, scikit-learn, LightGBM) donde los 16.97 M de filas de entrenamiento caben con margen en la memoria del proceso. El artefacto resultante (CalibratedClassifierCV sobre LightGBM, serializado con joblib) se subió al Volume de Databricks para su uso en el pipeline de producción.</w:t>
       </w:r>
     </w:p>
     <w:p>
@@ -6989,7 +7028,7 @@
         <w:rPr>
           <w:lang w:val="es-CO"/>
         </w:rPr>
-        <w:t xml:space="preserve">El scoring batch sobre las 19.71 M sesiones limpias introdujo tres restricciones no triviales del entorno Serverless, cada una con una decisión de ingeniería específica:</w:t>
+        <w:t>El scoring batch sobre las 19.71 M sesiones limpias introdujo tres restricciones no triviales del entorno Serverless, cada una con una decisión de ingeniería específica:</w:t>
       </w:r>
     </w:p>
     <w:p>
@@ -7011,7 +7050,7 @@
         <w:rPr>
           <w:lang w:val="es-CO"/>
         </w:rPr>
-        <w:t xml:space="preserve">Cargar el parquet completo en pandas (19.71 M filas) agota la memoria disponible del driver (salida con código 137, SIGKILL por OOM). La solución adoptada fue mantener los datos siempre en un Spark DataFrame perezoso —nunca materializado en el driver— y canalizar la inferencia a través de pandas UDFs que procesan particiones en minibloque. El único dato que baja al driver es la muestra de 300 k sesiones usada para ajustar el escalador y el K-Means (≈ 28 MB).</w:t>
+        <w:t>Cargar el parquet completo en pandas (19.71 M filas) agota la memoria disponible del driver (salida con código 137, SIGKILL por OOM). La solución adoptada fue mantener los datos siempre en un Spark DataFrame perezoso —nunca materializado en el driver— y canalizar la inferencia a través de pandas UDFs que procesan particiones en minibloque. El único dato que baja al driver es la muestra de 300 k sesiones usada para ajustar el escalador y el K-Means (≈ 28 MB).</w:t>
       </w:r>
     </w:p>
     <w:p>
@@ -7033,7 +7072,7 @@
         <w:rPr>
           <w:lang w:val="es-CO"/>
         </w:rPr>
-        <w:t xml:space="preserve">Databricks Serverless no expone el JVM sparkContext, lo que inhabilita el broadcast de objetos Python. Los UDFs de scoring y segmentación se implementaron con dos patrones: carga desde Volume dentro del UDF para el modelo de propensión (se deserializa una vez por partición Spark) y closures de Python para los objetos ligeros —StandardScaler y KMeans— cuyos artefactos serializados pesan pocos kilobytes.</w:t>
+        <w:t>Databricks Serverless no expone el JVM sparkContext, lo que inhabilita el broadcast de objetos Python. Los UDFs de scoring y segmentación se implementaron con dos patrones: carga desde Volume dentro del UDF para el modelo de propensión (se deserializa una vez por partición Spark) y closures de Python para los objetos ligeros —StandardScaler y KMeans— cuyos artefactos serializados pesan pocos kilobytes.</w:t>
       </w:r>
     </w:p>
     <w:p>
@@ -7055,7 +7094,7 @@
         <w:rPr>
           <w:lang w:val="es-CO"/>
         </w:rPr>
-        <w:t xml:space="preserve">El modelo fue entrenado localmente con NumPy 2.x, que introduce el submódulo interno numpy._core; el entorno Databricks tiene NumPy 1.23.5, que no lo incluye. La deserialización con joblib fallaba con ModuleNotFoundError. La solución fue (i) instalar NumPy 1.26.4 —compatible en binario con scikit-learn y SciPy ya compilados para la serie 1.x—, y (ii) registrar un alias de módulo (sys.modules['numpy._core'] = numpy.core y sus subpaquetes) antes de la deserialización, permitiendo que el pickle resuelva las referencias al módulo renombrado.</w:t>
+        <w:t>El modelo fue entrenado localmente con NumPy 2.x, que introduce el submódulo interno numpy._core; el entorno Databricks tiene NumPy 1.23.5, que no lo incluye. La deserialización con joblib fallaba con ModuleNotFoundError. La solución fue (i) instalar NumPy 1.26.4 —compatible en binario con scikit-learn y SciPy ya compilados para la serie 1.x—, y (ii) registrar un alias de módulo (sys.modules['numpy._core'] = numpy.core y sus subpaquetes) antes de la deserialización, permitiendo que el pickle resuelva las referencias al módulo renombrado.</w:t>
       </w:r>
     </w:p>
     <w:p>
@@ -7085,7 +7124,14 @@
         <w:rPr>
           <w:lang w:val="es-CO"/>
         </w:rPr>
-        <w:t xml:space="preserve">El resultado final es la tabla Delta workspace.default.contrato2 con 19.711.743 filas y cuatro columnas: user_session, prob_calibrada, segmento y segmento_nombre. La distribución por segmento es consistente con el perfil esperado de K-Means: general_bajo_valor 49.8 %, electronica_gama_media 29.5 %, electronica_premium 13.6 %, explorador 7.0 % y anómalo 0.05 %. Esta tabla es el contrato de consumo que alimenta el tablero Power BI (frente de visualización) y la lógica de targeting del A/B test (frente de orquestación).</w:t>
+        <w:t xml:space="preserve">El resultado final es la tabla Delta workspace.default.contrato2 con 19.711.743 filas y cuatro columnas: user_session, prob_calibrada, segmento y segmento_nombre. La distribución por segmento es consistente con el perfil esperado de K-Means: general_bajo_valor 49.8 %, electronica_gama_media 29.5 %, electronica_premium 13.6 %, explorador 7.0 % y anómalo </w:t>
+      </w:r>
+      <w:r>
+        <w:rPr>
+          <w:lang w:val="es-CO"/>
+        </w:rPr>
+        <w:lastRenderedPageBreak/>
+        <w:t>0.05 %. Esta tabla es el contrato de consumo que alimenta el tablero Power BI (frente de visualización) y la lógica de targeting del A/B test (frente de orquestación).</w:t>
       </w:r>
     </w:p>
     <w:p>
@@ -7095,7 +7141,7 @@
           <w:lang w:val="es-CO"/>
         </w:rPr>
       </w:pPr>
-      <w:bookmarkStart w:id="34" w:name="_Toc231856426"/>
+      <w:bookmarkStart w:id="34" w:name="_Toc231897066"/>
       <w:r>
         <w:rPr>
           <w:lang w:val="es-CO"/>
@@ -7106,7 +7152,7 @@
     </w:p>
     <w:p>
       <w:pPr>
-        <w:pStyle w:val="ListParagraph"/>
+        <w:pStyle w:val="Prrafodelista"/>
         <w:numPr>
           <w:ilvl w:val="0"/>
           <w:numId w:val="2"/>
@@ -7132,7 +7178,7 @@
     </w:p>
     <w:p>
       <w:pPr>
-        <w:pStyle w:val="ListParagraph"/>
+        <w:pStyle w:val="Prrafodelista"/>
         <w:numPr>
           <w:ilvl w:val="0"/>
           <w:numId w:val="2"/>
@@ -7158,7 +7204,7 @@
     </w:p>
     <w:p>
       <w:pPr>
-        <w:pStyle w:val="ListParagraph"/>
+        <w:pStyle w:val="Prrafodelista"/>
         <w:numPr>
           <w:ilvl w:val="0"/>
           <w:numId w:val="2"/>
@@ -7184,7 +7230,7 @@
     </w:p>
     <w:p>
       <w:pPr>
-        <w:pStyle w:val="ListParagraph"/>
+        <w:pStyle w:val="Prrafodelista"/>
         <w:spacing w:after="80"/>
         <w:ind w:left="720"/>
         <w:rPr>
@@ -7205,7 +7251,7 @@
           <w:lang w:val="es-CO"/>
         </w:rPr>
       </w:pPr>
-      <w:bookmarkStart w:id="35" w:name="_Toc231856427"/>
+      <w:bookmarkStart w:id="35" w:name="_Toc231897067"/>
       <w:r>
         <w:rPr>
           <w:lang w:val="es-CO"/>
@@ -7221,7 +7267,7 @@
           <w:lang w:val="es-CO"/>
         </w:rPr>
       </w:pPr>
-      <w:bookmarkStart w:id="36" w:name="_Toc231856428"/>
+      <w:bookmarkStart w:id="36" w:name="_Toc231897068"/>
       <w:r>
         <w:rPr>
           <w:lang w:val="es-CO"/>
@@ -7249,7 +7295,7 @@
       <w:pPr>
         <w:pStyle w:val="heading20"/>
       </w:pPr>
-      <w:bookmarkStart w:id="37" w:name="_Toc231856429"/>
+      <w:bookmarkStart w:id="37" w:name="_Toc231897069"/>
       <w:r>
         <w:t>5.2 Análisis (mapa pregunta → gráfico)</w:t>
       </w:r>
@@ -7257,7 +7303,7 @@
     </w:p>
     <w:p>
       <w:pPr>
-        <w:pStyle w:val="ListParagraph"/>
+        <w:pStyle w:val="Prrafodelista"/>
         <w:numPr>
           <w:ilvl w:val="0"/>
           <w:numId w:val="2"/>
@@ -7283,7 +7329,7 @@
     </w:p>
     <w:p>
       <w:pPr>
-        <w:pStyle w:val="ListParagraph"/>
+        <w:pStyle w:val="Prrafodelista"/>
         <w:numPr>
           <w:ilvl w:val="0"/>
           <w:numId w:val="2"/>
@@ -7309,7 +7355,7 @@
     </w:p>
     <w:p>
       <w:pPr>
-        <w:pStyle w:val="ListParagraph"/>
+        <w:pStyle w:val="Prrafodelista"/>
         <w:numPr>
           <w:ilvl w:val="0"/>
           <w:numId w:val="2"/>
@@ -7340,7 +7386,7 @@
           <w:lang w:val="es-CO"/>
         </w:rPr>
       </w:pPr>
-      <w:bookmarkStart w:id="38" w:name="_Toc231856430"/>
+      <w:bookmarkStart w:id="38" w:name="_Toc231897070"/>
       <w:r>
         <w:rPr>
           <w:lang w:val="es-CO"/>
@@ -7361,6 +7407,7 @@
         <w:rPr>
           <w:lang w:val="es-CO"/>
         </w:rPr>
+        <w:lastRenderedPageBreak/>
         <w:t>Siete páginas con navegación lateral (panel izquierdo de botones numerados, visible en todas): (1) Inicio, (2) El problema (embudo vistas→carrito→compra + KPIs de abandono), (3) Análisis por categoría (cuatro barras horizontales en 2×2 + Top-N), (4) Detalle Electronics (Top-N de marcas + scatter ticket × abandono), (5) Análisis de cliente (donut de tipología + Sankey compradores→revenue), (6) Contexto temporal (combo vistas vs conversión por hora) y (7) Cierre (respuesta a la Pregunta de Oro). Paleta semáforo coherente —gris #2D2D2D para contexto, verde #3B6D11 para oportunidad, rojo #A32D2D para alerta/pérdida— sobre tipografía Segoe UI, aplicando data-ink ratio, atributos preatentivos, Gestalt y patrón Z. Cada página cierra con una frase accionable (contexto → hallazgo → negocio → acción); la ventana 14–17 nov se filtra antes de graficar.</w:t>
       </w:r>
     </w:p>
@@ -7368,7 +7415,7 @@
       <w:pPr>
         <w:pStyle w:val="heading20"/>
       </w:pPr>
-      <w:bookmarkStart w:id="39" w:name="_Toc231856431"/>
+      <w:bookmarkStart w:id="39" w:name="_Toc231897071"/>
       <w:r>
         <w:t>5.4 Implementación</w:t>
       </w:r>
@@ -7376,7 +7423,7 @@
     </w:p>
     <w:p>
       <w:pPr>
-        <w:pStyle w:val="ListParagraph"/>
+        <w:pStyle w:val="Prrafodelista"/>
         <w:numPr>
           <w:ilvl w:val="0"/>
           <w:numId w:val="2"/>
@@ -7395,7 +7442,7 @@
     </w:p>
     <w:p>
       <w:pPr>
-        <w:pStyle w:val="ListParagraph"/>
+        <w:pStyle w:val="Prrafodelista"/>
         <w:numPr>
           <w:ilvl w:val="0"/>
           <w:numId w:val="2"/>
@@ -7414,7 +7461,7 @@
     </w:p>
     <w:p>
       <w:pPr>
-        <w:pStyle w:val="ListParagraph"/>
+        <w:pStyle w:val="Prrafodelista"/>
         <w:numPr>
           <w:ilvl w:val="0"/>
           <w:numId w:val="2"/>
@@ -7454,7 +7501,7 @@
           <w:lang w:val="es-CO"/>
         </w:rPr>
       </w:pPr>
-      <w:bookmarkStart w:id="40" w:name="_Toc231856432"/>
+      <w:bookmarkStart w:id="40" w:name="_Toc231897072"/>
       <w:r>
         <w:rPr>
           <w:lang w:val="es-CO"/>
@@ -7485,7 +7532,7 @@
           <w:lang w:val="es-CO"/>
         </w:rPr>
       </w:pPr>
-      <w:bookmarkStart w:id="41" w:name="_Toc231856433"/>
+      <w:bookmarkStart w:id="41" w:name="_Toc231897073"/>
       <w:r>
         <w:rPr>
           <w:lang w:val="es-CO"/>
@@ -7529,7 +7576,7 @@
     </w:p>
     <w:p>
       <w:pPr>
-        <w:pStyle w:val="ListParagraph"/>
+        <w:pStyle w:val="Prrafodelista"/>
         <w:numPr>
           <w:ilvl w:val="0"/>
           <w:numId w:val="3"/>
@@ -7543,18 +7590,12 @@
         <w:rPr>
           <w:lang w:val="es-CO"/>
         </w:rPr>
-        <w:t>Atacar la palanca A (carritos de electrónica abandonados) mediante</w:t>
-      </w:r>
-      <w:r>
-        <w:rPr>
-          <w:lang w:val="es-CO"/>
-        </w:rPr>
-        <w:t xml:space="preserve"> el A/B test de incentivo sobre el segmento C3.</w:t>
-      </w:r>
-    </w:p>
-    <w:p>
-      <w:pPr>
-        <w:pStyle w:val="ListParagraph"/>
+        <w:t>Atacar la palanca A (carritos de electrónica abandonados) mediante el A/B test de incentivo sobre el segmento C3.</w:t>
+      </w:r>
+    </w:p>
+    <w:p>
+      <w:pPr>
+        <w:pStyle w:val="Prrafodelista"/>
         <w:numPr>
           <w:ilvl w:val="0"/>
           <w:numId w:val="3"/>
@@ -7573,7 +7614,7 @@
     </w:p>
     <w:p>
       <w:pPr>
-        <w:pStyle w:val="ListParagraph"/>
+        <w:pStyle w:val="Prrafodelista"/>
         <w:numPr>
           <w:ilvl w:val="0"/>
           <w:numId w:val="3"/>
@@ -7587,6 +7628,7 @@
         <w:rPr>
           <w:lang w:val="es-CO"/>
         </w:rPr>
+        <w:lastRenderedPageBreak/>
         <w:t>Usar el modelo de propensión para targeting fino dentro de C3, gastando el incentivo donde hay intención real.</w:t>
       </w:r>
     </w:p>
@@ -7604,7 +7646,7 @@
     </w:p>
     <w:p>
       <w:pPr>
-        <w:pStyle w:val="ListParagraph"/>
+        <w:pStyle w:val="Prrafodelista"/>
         <w:numPr>
           <w:ilvl w:val="0"/>
           <w:numId w:val="2"/>
@@ -7623,7 +7665,7 @@
     </w:p>
     <w:p>
       <w:pPr>
-        <w:pStyle w:val="ListParagraph"/>
+        <w:pStyle w:val="Prrafodelista"/>
         <w:numPr>
           <w:ilvl w:val="0"/>
           <w:numId w:val="2"/>
@@ -7637,18 +7679,12 @@
         <w:rPr>
           <w:lang w:val="es-CO"/>
         </w:rPr>
-        <w:t>Grandes Datos: pipeline Medallion sobre Delta, ingesta Kappa reproducible, particionamiento por tamaño con evi</w:t>
-      </w:r>
-      <w:r>
-        <w:rPr>
-          <w:lang w:val="es-CO"/>
-        </w:rPr>
-        <w:t>dencia medida.</w:t>
-      </w:r>
-    </w:p>
-    <w:p>
-      <w:pPr>
-        <w:pStyle w:val="ListParagraph"/>
+        <w:t>Grandes Datos: pipeline Medallion sobre Delta, ingesta Kappa reproducible, particionamiento por tamaño con evidencia medida.</w:t>
+      </w:r>
+    </w:p>
+    <w:p>
+      <w:pPr>
+        <w:pStyle w:val="Prrafodelista"/>
         <w:numPr>
           <w:ilvl w:val="0"/>
           <w:numId w:val="2"/>
@@ -7669,7 +7705,7 @@
       <w:pPr>
         <w:pStyle w:val="heading10"/>
       </w:pPr>
-      <w:bookmarkStart w:id="42" w:name="_Toc231856434"/>
+      <w:bookmarkStart w:id="42" w:name="_Toc231897074"/>
       <w:r>
         <w:t>7. Referencias</w:t>
       </w:r>
@@ -7677,7 +7713,7 @@
     </w:p>
     <w:p>
       <w:pPr>
-        <w:pStyle w:val="ListParagraph"/>
+        <w:pStyle w:val="Prrafodelista"/>
         <w:numPr>
           <w:ilvl w:val="0"/>
           <w:numId w:val="2"/>
@@ -7687,16 +7723,10 @@
       <w:r>
         <w:t>Kechinov, M. (2020). eCommerce behavior data from multi category store (REES46) [Conjunto de datos]. Kaggle. https://www.kaggle.com/datasets/mkechinov/ecommerce-behavior-data-from-multi-category-store</w:t>
       </w:r>
-      <w:r>
-        <w:rPr>
-          <w:i/>
-          <w:iCs/>
-        </w:rPr>
-      </w:r>
-    </w:p>
-    <w:p>
-      <w:pPr>
-        <w:pStyle w:val="ListParagraph"/>
+    </w:p>
+    <w:p>
+      <w:pPr>
+        <w:pStyle w:val="Prrafodelista"/>
         <w:numPr>
           <w:ilvl w:val="0"/>
           <w:numId w:val="2"/>
@@ -7715,7 +7745,7 @@
     </w:p>
     <w:p>
       <w:pPr>
-        <w:pStyle w:val="ListParagraph"/>
+        <w:pStyle w:val="Prrafodelista"/>
         <w:numPr>
           <w:ilvl w:val="0"/>
           <w:numId w:val="2"/>
@@ -7734,7 +7764,7 @@
     </w:p>
     <w:p>
       <w:pPr>
-        <w:pStyle w:val="ListParagraph"/>
+        <w:pStyle w:val="Prrafodelista"/>
         <w:numPr>
           <w:ilvl w:val="0"/>
           <w:numId w:val="2"/>
@@ -7753,7 +7783,7 @@
     </w:p>
     <w:p>
       <w:pPr>
-        <w:pStyle w:val="ListParagraph"/>
+        <w:pStyle w:val="Prrafodelista"/>
         <w:numPr>
           <w:ilvl w:val="0"/>
           <w:numId w:val="2"/>
@@ -7763,15 +7793,10 @@
       <w:r>
         <w:t>Software y librerías: Python 3.11; scikit-learn 1.6.1; LightGBM 4.6.0; XGBoost; Optuna; Apache Spark 3.5 con Delta Lake; MLflow; Power BI.</w:t>
       </w:r>
-      <w:r>
-        <w:rPr>
-          <w:i/>
-        </w:rPr>
-      </w:r>
-    </w:p>
-    <w:p>
-      <w:pPr>
-        <w:pStyle w:val="ListParagraph"/>
+    </w:p>
+    <w:p>
+      <w:pPr>
+        <w:pStyle w:val="Prrafodelista"/>
         <w:spacing w:after="120"/>
         <w:rPr>
           <w:lang w:val="es-CO"/>
@@ -7788,7 +7813,7 @@
     </w:p>
     <w:p>
       <w:pPr>
-        <w:pStyle w:val="ListParagraph"/>
+        <w:pStyle w:val="Prrafodelista"/>
       </w:pPr>
       <w:r>
         <w:t>Ke, G., Meng, Q., Finley, T., Wang, T., Chen, W., Ma, W., Ye, Q., &amp; Liu, T.-Y. (2017). LightGBM: A highly efficient gradient boosting decision tree. En Advances in Neural Information Processing Systems (Vol. 30, pp. 3146–3154).</w:t>
@@ -7796,7 +7821,7 @@
     </w:p>
     <w:p>
       <w:pPr>
-        <w:pStyle w:val="ListParagraph"/>
+        <w:pStyle w:val="Prrafodelista"/>
       </w:pPr>
       <w:r>
         <w:t>Akiba, T., Sano, S., Yanase, T., Ohta, T., &amp; Koyama, M. (2019). Optuna: A next-generation hyperparameter optimization framework. En Proceedings of the 25th ACM SIGKDD (pp. 2623–2631). https://doi.org/10.1145/3292500.3330701</w:t>
@@ -7804,7 +7829,7 @@
     </w:p>
     <w:p>
       <w:pPr>
-        <w:pStyle w:val="ListParagraph"/>
+        <w:pStyle w:val="Prrafodelista"/>
       </w:pPr>
       <w:r>
         <w:t>Pedregosa, F., et al. (2011). Scikit-learn: Machine learning in Python. Journal of Machine Learning Research, 12, 2825–2830.</w:t>
@@ -7812,7 +7837,7 @@
     </w:p>
     <w:p>
       <w:pPr>
-        <w:pStyle w:val="ListParagraph"/>
+        <w:pStyle w:val="Prrafodelista"/>
       </w:pPr>
       <w:r>
         <w:t>Davis, J., &amp; Goadrich, M. (2006). The relationship between precision-recall and ROC curves. En Proceedings of the 23rd International Conference on Machine Learning (pp. 233–240). https://doi.org/10.1145/1143844.1143874</w:t>
@@ -7820,7 +7845,7 @@
     </w:p>
     <w:p>
       <w:pPr>
-        <w:pStyle w:val="ListParagraph"/>
+        <w:pStyle w:val="Prrafodelista"/>
       </w:pPr>
       <w:r>
         <w:t>Niculescu-Mizil, A., &amp; Caruana, R. (2005). Predicting good probabilities with supervised learning. En Proceedings of the 22nd International Conference on Machine Learning (pp. 625–632).</w:t>
@@ -7828,7 +7853,7 @@
     </w:p>
     <w:p>
       <w:pPr>
-        <w:pStyle w:val="ListParagraph"/>
+        <w:pStyle w:val="Prrafodelista"/>
       </w:pPr>
       <w:r>
         <w:t>Lloyd, S. P. (1982). Least squares quantization in PCM. IEEE Transactions on Information Theory, 28(2), 129–137.</w:t>
@@ -7836,7 +7861,7 @@
     </w:p>
     <w:p>
       <w:pPr>
-        <w:pStyle w:val="ListParagraph"/>
+        <w:pStyle w:val="Prrafodelista"/>
       </w:pPr>
       <w:r>
         <w:t>Ester, M., Kriegel, H.-P., Sander, J., &amp; Xu, X. (1996). A density-based algorithm for discovering clusters in large spatial databases with noise. En Proceedings of KDD-96 (pp. 226–231).</w:t>
@@ -7844,7 +7869,7 @@
     </w:p>
     <w:p>
       <w:pPr>
-        <w:pStyle w:val="ListParagraph"/>
+        <w:pStyle w:val="Prrafodelista"/>
       </w:pPr>
       <w:r>
         <w:t>Kohavi, R., Tang, D., &amp; Xu, Y. (2020). Trustworthy online controlled experiments: A practical guide to A/B testing. Cambridge University Press.</w:t>
@@ -7852,7 +7877,7 @@
     </w:p>
     <w:p>
       <w:pPr>
-        <w:pStyle w:val="ListParagraph"/>
+        <w:pStyle w:val="Prrafodelista"/>
       </w:pPr>
       <w:r>
         <w:t>Zaharia, M., Xin, R. S., Wendell, P., et al. (2016). Apache Spark: A unified engine for big data processing. Communications of the ACM, 59(11), 56–65. https://doi.org/10.1145/2934664</w:t>
@@ -7860,9 +7885,10 @@
     </w:p>
     <w:p>
       <w:pPr>
-        <w:pStyle w:val="ListParagraph"/>
-      </w:pPr>
-      <w:r>
+        <w:pStyle w:val="Prrafodelista"/>
+      </w:pPr>
+      <w:r>
+        <w:lastRenderedPageBreak/>
         <w:t>Armbrust, M., Das, T., Sun, L., et al. (2020). Delta Lake: High-performance ACID table storage over cloud object stores. Proceedings of the VLDB Endowment, 13(12), 3411–3424.</w:t>
       </w:r>
     </w:p>
@@ -8718,7 +8744,7 @@
     <w:name w:val="Normal"/>
     <w:qFormat/>
   </w:style>
-  <w:style w:type="paragraph" w:styleId="Heading1">
+  <w:style w:type="paragraph" w:styleId="Ttulo1">
     <w:name w:val="heading 1"/>
     <w:uiPriority w:val="9"/>
     <w:qFormat/>
@@ -8731,7 +8757,7 @@
       <w:szCs w:val="32"/>
     </w:rPr>
   </w:style>
-  <w:style w:type="paragraph" w:styleId="Heading2">
+  <w:style w:type="paragraph" w:styleId="Ttulo2">
     <w:name w:val="heading 2"/>
     <w:uiPriority w:val="9"/>
     <w:semiHidden/>
@@ -8746,7 +8772,7 @@
       <w:szCs w:val="26"/>
     </w:rPr>
   </w:style>
-  <w:style w:type="paragraph" w:styleId="Heading3">
+  <w:style w:type="paragraph" w:styleId="Ttulo3">
     <w:name w:val="heading 3"/>
     <w:uiPriority w:val="9"/>
     <w:semiHidden/>
@@ -8761,7 +8787,7 @@
       <w:szCs w:val="24"/>
     </w:rPr>
   </w:style>
-  <w:style w:type="paragraph" w:styleId="Heading4">
+  <w:style w:type="paragraph" w:styleId="Ttulo4">
     <w:name w:val="heading 4"/>
     <w:uiPriority w:val="9"/>
     <w:semiHidden/>
@@ -8776,7 +8802,7 @@
       <w:color w:val="2E74B5"/>
     </w:rPr>
   </w:style>
-  <w:style w:type="paragraph" w:styleId="Heading5">
+  <w:style w:type="paragraph" w:styleId="Ttulo5">
     <w:name w:val="heading 5"/>
     <w:uiPriority w:val="9"/>
     <w:semiHidden/>
@@ -8789,7 +8815,7 @@
       <w:color w:val="2E74B5"/>
     </w:rPr>
   </w:style>
-  <w:style w:type="paragraph" w:styleId="Heading6">
+  <w:style w:type="paragraph" w:styleId="Ttulo6">
     <w:name w:val="heading 6"/>
     <w:uiPriority w:val="9"/>
     <w:semiHidden/>
@@ -8802,13 +8828,13 @@
       <w:color w:val="1F4D78"/>
     </w:rPr>
   </w:style>
-  <w:style w:type="character" w:default="1" w:styleId="DefaultParagraphFont">
+  <w:style w:type="character" w:default="1" w:styleId="Fuentedeprrafopredeter">
     <w:name w:val="Default Paragraph Font"/>
     <w:uiPriority w:val="1"/>
     <w:semiHidden/>
     <w:unhideWhenUsed/>
   </w:style>
-  <w:style w:type="table" w:default="1" w:styleId="TableNormal">
+  <w:style w:type="table" w:default="1" w:styleId="Tablanormal">
     <w:name w:val="Normal Table"/>
     <w:uiPriority w:val="99"/>
     <w:semiHidden/>
@@ -8823,13 +8849,13 @@
       </w:tblCellMar>
     </w:tblPr>
   </w:style>
-  <w:style w:type="numbering" w:default="1" w:styleId="NoList">
+  <w:style w:type="numbering" w:default="1" w:styleId="Sinlista">
     <w:name w:val="No List"/>
     <w:uiPriority w:val="99"/>
     <w:semiHidden/>
     <w:unhideWhenUsed/>
   </w:style>
-  <w:style w:type="paragraph" w:styleId="Title">
+  <w:style w:type="paragraph" w:styleId="Ttulo">
     <w:name w:val="Title"/>
     <w:uiPriority w:val="10"/>
     <w:qFormat/>
@@ -8851,11 +8877,11 @@
       <w:szCs w:val="24"/>
     </w:rPr>
   </w:style>
-  <w:style w:type="paragraph" w:styleId="ListParagraph">
+  <w:style w:type="paragraph" w:styleId="Prrafodelista">
     <w:name w:val="List Paragraph"/>
     <w:qFormat/>
   </w:style>
-  <w:style w:type="character" w:styleId="Hyperlink">
+  <w:style w:type="character" w:styleId="Hipervnculo">
     <w:name w:val="Hyperlink"/>
     <w:uiPriority w:val="99"/>
     <w:unhideWhenUsed/>
@@ -8864,7 +8890,7 @@
       <w:u w:val="single"/>
     </w:rPr>
   </w:style>
-  <w:style w:type="character" w:styleId="FootnoteReference">
+  <w:style w:type="character" w:styleId="Refdenotaalpie">
     <w:name w:val="footnote reference"/>
     <w:uiPriority w:val="99"/>
     <w:semiHidden/>
@@ -8873,9 +8899,9 @@
       <w:vertAlign w:val="superscript"/>
     </w:rPr>
   </w:style>
-  <w:style w:type="paragraph" w:styleId="FootnoteText">
+  <w:style w:type="paragraph" w:styleId="Textonotapie">
     <w:name w:val="footnote text"/>
-    <w:link w:val="FootnoteTextChar"/>
+    <w:link w:val="TextonotapieCar"/>
     <w:uiPriority w:val="99"/>
     <w:semiHidden/>
     <w:unhideWhenUsed/>
@@ -8884,9 +8910,9 @@
       <w:szCs w:val="20"/>
     </w:rPr>
   </w:style>
-  <w:style w:type="character" w:customStyle="1" w:styleId="FootnoteTextChar">
-    <w:name w:val="Footnote Text Char"/>
-    <w:link w:val="FootnoteText"/>
+  <w:style w:type="character" w:customStyle="1" w:styleId="TextonotapieCar">
+    <w:name w:val="Texto nota pie Car"/>
+    <w:link w:val="Textonotapie"/>
     <w:uiPriority w:val="99"/>
     <w:semiHidden/>
     <w:unhideWhenUsed/>
@@ -8895,7 +8921,7 @@
       <w:szCs w:val="20"/>
     </w:rPr>
   </w:style>
-  <w:style w:type="character" w:styleId="EndnoteReference">
+  <w:style w:type="character" w:styleId="Refdenotaalfinal">
     <w:name w:val="endnote reference"/>
     <w:uiPriority w:val="99"/>
     <w:semiHidden/>
@@ -8904,9 +8930,9 @@
       <w:vertAlign w:val="superscript"/>
     </w:rPr>
   </w:style>
-  <w:style w:type="paragraph" w:styleId="EndnoteText">
+  <w:style w:type="paragraph" w:styleId="Textonotaalfinal">
     <w:name w:val="endnote text"/>
-    <w:link w:val="EndnoteTextChar"/>
+    <w:link w:val="TextonotaalfinalCar"/>
     <w:uiPriority w:val="99"/>
     <w:semiHidden/>
     <w:unhideWhenUsed/>
@@ -8915,9 +8941,9 @@
       <w:szCs w:val="20"/>
     </w:rPr>
   </w:style>
-  <w:style w:type="character" w:customStyle="1" w:styleId="EndnoteTextChar">
-    <w:name w:val="Endnote Text Char"/>
-    <w:link w:val="EndnoteText"/>
+  <w:style w:type="character" w:customStyle="1" w:styleId="TextonotaalfinalCar">
+    <w:name w:val="Texto nota al final Car"/>
+    <w:link w:val="Textonotaalfinal"/>
     <w:uiPriority w:val="99"/>
     <w:semiHidden/>
     <w:unhideWhenUsed/>
@@ -8969,10 +8995,10 @@
       <w:color w:val="595959"/>
     </w:rPr>
   </w:style>
-  <w:style w:type="paragraph" w:styleId="CommentText">
+  <w:style w:type="paragraph" w:styleId="Textocomentario">
     <w:name w:val="annotation text"/>
     <w:basedOn w:val="Normal"/>
-    <w:link w:val="CommentTextChar"/>
+    <w:link w:val="TextocomentarioCar"/>
     <w:uiPriority w:val="99"/>
     <w:semiHidden/>
     <w:unhideWhenUsed/>
@@ -8981,10 +9007,10 @@
       <w:szCs w:val="20"/>
     </w:rPr>
   </w:style>
-  <w:style w:type="character" w:customStyle="1" w:styleId="CommentTextChar">
-    <w:name w:val="Comment Text Char"/>
-    <w:basedOn w:val="DefaultParagraphFont"/>
-    <w:link w:val="CommentText"/>
+  <w:style w:type="character" w:customStyle="1" w:styleId="TextocomentarioCar">
+    <w:name w:val="Texto comentario Car"/>
+    <w:basedOn w:val="Fuentedeprrafopredeter"/>
+    <w:link w:val="Textocomentario"/>
     <w:uiPriority w:val="99"/>
     <w:semiHidden/>
     <w:rPr>
@@ -8992,9 +9018,9 @@
       <w:szCs w:val="20"/>
     </w:rPr>
   </w:style>
-  <w:style w:type="character" w:styleId="CommentReference">
+  <w:style w:type="character" w:styleId="Refdecomentario">
     <w:name w:val="annotation reference"/>
-    <w:basedOn w:val="DefaultParagraphFont"/>
+    <w:basedOn w:val="Fuentedeprrafopredeter"/>
     <w:uiPriority w:val="99"/>
     <w:semiHidden/>
     <w:unhideWhenUsed/>
@@ -9003,10 +9029,10 @@
       <w:szCs w:val="16"/>
     </w:rPr>
   </w:style>
-  <w:style w:type="paragraph" w:styleId="Header">
+  <w:style w:type="paragraph" w:styleId="Encabezado">
     <w:name w:val="header"/>
     <w:basedOn w:val="Normal"/>
-    <w:link w:val="HeaderChar"/>
+    <w:link w:val="EncabezadoCar"/>
     <w:uiPriority w:val="99"/>
     <w:semiHidden/>
     <w:unhideWhenUsed/>
@@ -9018,18 +9044,18 @@
       </w:tabs>
     </w:pPr>
   </w:style>
-  <w:style w:type="character" w:customStyle="1" w:styleId="HeaderChar">
-    <w:name w:val="Header Char"/>
-    <w:basedOn w:val="DefaultParagraphFont"/>
-    <w:link w:val="Header"/>
+  <w:style w:type="character" w:customStyle="1" w:styleId="EncabezadoCar">
+    <w:name w:val="Encabezado Car"/>
+    <w:basedOn w:val="Fuentedeprrafopredeter"/>
+    <w:link w:val="Encabezado"/>
     <w:uiPriority w:val="99"/>
     <w:semiHidden/>
     <w:rsid w:val="00C92DBA"/>
   </w:style>
-  <w:style w:type="paragraph" w:styleId="Footer">
+  <w:style w:type="paragraph" w:styleId="Piedepgina">
     <w:name w:val="footer"/>
     <w:basedOn w:val="Normal"/>
-    <w:link w:val="FooterChar"/>
+    <w:link w:val="PiedepginaCar"/>
     <w:uiPriority w:val="99"/>
     <w:semiHidden/>
     <w:unhideWhenUsed/>
@@ -9041,10 +9067,10 @@
       </w:tabs>
     </w:pPr>
   </w:style>
-  <w:style w:type="character" w:customStyle="1" w:styleId="FooterChar">
-    <w:name w:val="Footer Char"/>
-    <w:basedOn w:val="DefaultParagraphFont"/>
-    <w:link w:val="Footer"/>
+  <w:style w:type="character" w:customStyle="1" w:styleId="PiedepginaCar">
+    <w:name w:val="Pie de página Car"/>
+    <w:basedOn w:val="Fuentedeprrafopredeter"/>
+    <w:link w:val="Piedepgina"/>
     <w:uiPriority w:val="99"/>
     <w:semiHidden/>
     <w:rsid w:val="00C92DBA"/>
@@ -9057,6 +9083,44 @@
       <w:b/>
       <w:bCs/>
     </w:rPr>
+  </w:style>
+  <w:style w:type="paragraph" w:styleId="TDC1">
+    <w:name w:val="toc 1"/>
+    <w:basedOn w:val="Normal"/>
+    <w:next w:val="Normal"/>
+    <w:autoRedefine/>
+    <w:uiPriority w:val="39"/>
+    <w:unhideWhenUsed/>
+    <w:rsid w:val="00310010"/>
+    <w:pPr>
+      <w:spacing w:after="100"/>
+    </w:pPr>
+  </w:style>
+  <w:style w:type="paragraph" w:styleId="TDC2">
+    <w:name w:val="toc 2"/>
+    <w:basedOn w:val="Normal"/>
+    <w:next w:val="Normal"/>
+    <w:autoRedefine/>
+    <w:uiPriority w:val="39"/>
+    <w:unhideWhenUsed/>
+    <w:rsid w:val="00310010"/>
+    <w:pPr>
+      <w:spacing w:after="100"/>
+      <w:ind w:left="220"/>
+    </w:pPr>
+  </w:style>
+  <w:style w:type="paragraph" w:styleId="TDC3">
+    <w:name w:val="toc 3"/>
+    <w:basedOn w:val="Normal"/>
+    <w:next w:val="Normal"/>
+    <w:autoRedefine/>
+    <w:uiPriority w:val="39"/>
+    <w:unhideWhenUsed/>
+    <w:rsid w:val="00310010"/>
+    <w:pPr>
+      <w:spacing w:after="100"/>
+      <w:ind w:left="440"/>
+    </w:pPr>
   </w:style>
 </w:styles>
 </file>

</xml_diff>